<commit_message>
docs: unesi APR podatke stranaka u izjašnjenje (Vuković Commerce 2015, Begej Shipyards Group)
</commit_message>
<xml_diff>
--- a/izvestaj/Podnesak_MUP_Zrenjanin_izjasnjenje.docx
+++ b/izvestaj/Podnesak_MUP_Zrenjanin_izjasnjenje.docx
@@ -115,7 +115,7 @@
         <w:t>OŠTEĆENI / PODNOSILAC:</w:t>
       </w:r>
       <w:r>
-        <w:t xml:space="preserve"> „VUKOVIĆ COMMERCE 2015" d.o.o., Veternik, Novosadski put br. 106, MB: [___________], PIB: [___________], koga zastupa zakonski zastupnik [_____________________]</w:t>
+        <w:t xml:space="preserve"> „VUKOVIĆ COMMERCE 2015" d.o.o. za proizvodnju, trgovinu i usluge, Veternik, Novosadski put br. 106, MB: 21085251, PIB: 108875815, koga zastupa direktor Stevan Janković</w:t>
       </w:r>
     </w:p>
     <w:p>
@@ -199,10 +199,10 @@
         <w:rPr>
           <w:b/>
         </w:rPr>
-        <w:t>„Begej Shipyards Group" d.o.o., Zrenjanin</w:t>
+        <w:t>„BEGEJ SHIPYARDS GROUP" d.o.o. Zrenjanin</w:t>
       </w:r>
       <w:r>
-        <w:t xml:space="preserve"> [</w:t>
+        <w:t>, Temišvarski drum bb, Zrenjanin, MB: 21541575, PIB: 111793711 (pretežna delatnost: popravka i održavanje brodova i čamaca — šifra 3315), [</w:t>
       </w:r>
       <w:r>
         <w:rPr>
@@ -342,16 +342,16 @@
         <w:rPr>
           <w:b/>
         </w:rPr>
-        <w:t>„Begej Shipyards Group" d.o.o., Zrenjanin</w:t>
+        <w:t>„BEGEJ SHIPYARDS GROUP" d.o.o. Zrenjanin</w:t>
       </w:r>
       <w:r>
-        <w:t>, [</w:t>
+        <w:t>, sa sedištem na adresi Temišvarski drum bb, Zrenjanin, MB: 21541575, PIB: 111793711, čija je pretežna registrovana delatnost popravka i održavanje brodova i čamaca (šifra delatnosti 3315), [</w:t>
       </w:r>
       <w:r>
         <w:rPr>
           <w:i/>
         </w:rPr>
-        <w:t>upisati: sedište, MB/PIB; broj i datum ugovora o remontu, odnosno osnov predaje; datum predaje plovila</w:t>
+        <w:t>upisati: broj i datum ugovora o remontu, odnosno osnov predaje; datum predaje plovila</w:t>
       </w:r>
       <w:r>
         <w:t>]. Plovilo je od predaje do dana ugovorene primopredaje bilo u državini i pod nadzorom navedenog privrednog društva.</w:t>
@@ -376,10 +376,10 @@
         <w:rPr>
           <w:b/>
         </w:rPr>
-        <w:t>„Begej Shipyards Group" d.o.o., Zrenjanin</w:t>
+        <w:t>„BEGEJ SHIPYARDS GROUP" d.o.o. Zrenjanin</w:t>
       </w:r>
       <w:r>
-        <w:t>, kao izvođač radova kome je plovilo povereno, preko svog odgovornog lica [</w:t>
+        <w:t xml:space="preserve"> (MB: 21541575, PIB: 111793711), kao izvođač radova kome je plovilo povereno, preko svog odgovornog lica [</w:t>
       </w:r>
       <w:r>
         <w:rPr>

</xml_diff>

<commit_message>
docs: uskladi izjašnjenje sa dopisom od 24.09.2025 (ćirilica, štetnici, preciziran zahtev)
</commit_message>
<xml_diff>
--- a/izvestaj/Podnesak_MUP_Zrenjanin_izjasnjenje.docx
+++ b/izvestaj/Podnesak_MUP_Zrenjanin_izjasnjenje.docx
@@ -8,7 +8,7 @@
         <w:jc w:val="center"/>
       </w:pPr>
       <w:r>
-        <w:t>REPUBLIKA SRBIJA — MINISTARSTVO UNUTRAŠNJIH POSLOVA</w:t>
+        <w:t>МИНИСТАРСТВО УНУТРАШЊИХ ПОСЛОВА</w:t>
       </w:r>
     </w:p>
     <w:p>
@@ -20,7 +20,7 @@
         <w:rPr>
           <w:b/>
         </w:rPr>
-        <w:t>DIREKCIJA POLICIJE — POLICIJSKA UPRAVA ZRENJANIN</w:t>
+        <w:t>ПУ ЗРЕЊАНИН</w:t>
       </w:r>
       <w:r/>
     </w:p>
@@ -29,24 +29,7 @@
         <w:jc w:val="both"/>
       </w:pPr>
       <w:r>
-        <w:t xml:space="preserve">[Odeljenje/Odsek kriminalističke policije — </w:t>
-      </w:r>
-      <w:r>
-        <w:rPr>
-          <w:i/>
-        </w:rPr>
-        <w:t>upisati organizacionu jedinicu</w:t>
-      </w:r>
-      <w:r>
-        <w:t>]</w:t>
-      </w:r>
-    </w:p>
-    <w:p>
-      <w:pPr>
-        <w:jc w:val="both"/>
-      </w:pPr>
-      <w:r>
-        <w:t>Zrenjanin</w:t>
+        <w:t>Др Зорана Каменковића бр. 10, 23000 Зрењанин</w:t>
       </w:r>
     </w:p>
     <w:p>
@@ -58,31 +41,16 @@
         <w:rPr>
           <w:b/>
         </w:rPr>
-        <w:t>VEZA:</w:t>
+        <w:t>ВЕЗА:</w:t>
       </w:r>
       <w:r>
-        <w:t xml:space="preserve"> Krivična prijava / službena beleška povodom događaja od 11.09.2025. godine</w:t>
-      </w:r>
-    </w:p>
-    <w:p>
-      <w:pPr>
-        <w:jc w:val="both"/>
-      </w:pPr>
-      <w:r/>
-      <w:r>
-        <w:rPr>
-          <w:b/>
-        </w:rPr>
-        <w:t>Broj predmeta:</w:t>
-      </w:r>
-      <w:r>
-        <w:t xml:space="preserve"> KU br. [_______/2025] (</w:t>
+        <w:t xml:space="preserve"> крађа на броду Бечеј 1, пријављена дана 11.09.2025. године; Допис пуномоћника оштећеног са одштетним захтевом од 24.09.2025. године; КУ бр. [_______] (</w:t>
       </w:r>
       <w:r>
         <w:rPr>
           <w:i/>
         </w:rPr>
-        <w:t>upisati broj predmeta / KU broj</w:t>
+        <w:t>уписати број предмета</w:t>
       </w:r>
       <w:r>
         <w:t>)</w:t>
@@ -97,10 +65,10 @@
         <w:rPr>
           <w:b/>
         </w:rPr>
-        <w:t>Postupajući službenik:</w:t>
+        <w:t>ОШТЕЋЕНИ:</w:t>
       </w:r>
       <w:r>
-        <w:t xml:space="preserve"> [_____________________]</w:t>
+        <w:t xml:space="preserve"> VUKOVIĆ COMMERCE 2015 DOO VETERNIK из Ветерника, ул. Новосадски пут бр. 106, МБ: 21085251, ПИБ: 108875815, а којег оштећеног по приложеној пуномоћи заступа адв. Милан Мишић из Новог Сада, ул. Максима Горког бр. 6</w:t>
       </w:r>
     </w:p>
     <w:p>
@@ -112,25 +80,24 @@
         <w:rPr>
           <w:b/>
         </w:rPr>
-        <w:t>OŠTEĆENI / PODNOSILAC:</w:t>
+        <w:t>ШТЕТНИК:</w:t>
       </w:r>
+      <w:r/>
+    </w:p>
+    <w:p>
+      <w:pPr>
+        <w:ind w:left="425"/>
+      </w:pPr>
       <w:r>
-        <w:t xml:space="preserve"> „VUKOVIĆ COMMERCE 2015" d.o.o. za proizvodnju, trgovinu i usluge, Veternik, Novosadski put br. 106, MB: 21085251, PIB: 108875815, koga zastupa direktor Stevan Janković</w:t>
+        <w:t>1. BEGEJ SHIPYARDS GROUP DOO ZRENJANIN из Зрењанина, ул. Темишварски друм ББ, МБ: 21541575, ПИБ: 111793711</w:t>
       </w:r>
     </w:p>
     <w:p>
       <w:pPr>
-        <w:jc w:val="both"/>
+        <w:ind w:left="425"/>
       </w:pPr>
-      <w:r/>
       <w:r>
-        <w:rPr>
-          <w:b/>
-        </w:rPr>
-        <w:t>PUNOMOĆNIK:</w:t>
-      </w:r>
-      <w:r>
-        <w:t xml:space="preserve"> Milan Mišić, advokat iz [___________], ul. [_____________________] (punomoćje u prilogu)</w:t>
+        <w:t>2. Душко Топаловић, ЈМБГ: 2310981710203, као директор прив. друштва BEGEJ SHIPYARDS GROUP DOO ZRENJANIN из Зрењанина, ул. Темишварски друм ББ, МБ: 21541575, ПИБ: 111793711</w:t>
       </w:r>
     </w:p>
     <w:p>
@@ -139,28 +106,31 @@
         <w:jc w:val="center"/>
       </w:pPr>
       <w:r>
-        <w:t>IZJAŠNJENJE OŠTEĆENOG NA OKOLNOSTI VREDNOSTI OTUĐENIH STVARI — TAKSATIVNI POPIS OTUĐENIH I OŠTEĆENIH STVARI — SA ODŠTETNIM ZAHTEVOM</w:t>
+        <w:t>ИЗЈАШЊЕЊЕ ПУНОМОЋНИКА ОШТЕЋЕНОГ НА ОКОЛНОСТИ ВРЕДНОСТИ ОТУЂЕНИХ СТВАРИ — ТАКСАТИВНИ ПОПИС ОТУЂЕНИХ И ОШТЕЋЕНИХ СТВАРИ — СА ПРЕЦИЗИРАНИМ ОДШТЕТНИМ ЗАХТЕВОМ</w:t>
       </w:r>
     </w:p>
     <w:p>
       <w:pPr>
         <w:jc w:val="both"/>
       </w:pPr>
-      <w:r/>
       <w:r>
-        <w:rPr>
-          <w:i/>
-        </w:rPr>
-        <w:t>(dopuna krivične prijave — izjašnjenje po zahtevu postupajućeg organa)</w:t>
+        <w:t>2 примерка</w:t>
       </w:r>
-      <w:r/>
     </w:p>
     <w:p>
       <w:pPr>
         <w:jc w:val="both"/>
       </w:pPr>
       <w:r>
-        <w:t>Postupajući po zahtevu tog organa da se oštećeni izjasni na okolnosti vrednosti otuđenih stvari, i to taksativno u odštetnom zahtevu, kao i na okolnosti starosti broda i otuđenih delova, kome je brod ostavljen na remont i ko je trebalo da izvrši primopredaju broda po završenim radovima, oštećeni daje sledeće</w:t>
+        <w:t>Поштовани,</w:t>
+      </w:r>
+    </w:p>
+    <w:p>
+      <w:pPr>
+        <w:jc w:val="both"/>
+      </w:pPr>
+      <w:r>
+        <w:t>поступајући по захтеву тог органа да се оштећени изјасни на околности вредности отуђених ствари, и то таксативно у одштетном захтеву, као и на околности колико је година брод стар као и отуђени делови, коме је брод остављен на ремонт и ко је требало да изврши примопредају брода по завршеним радовима, дајемо следеће изјашњење:</w:t>
       </w:r>
     </w:p>
     <w:p>
@@ -168,7 +138,7 @@
         <w:pStyle w:val="Heading2"/>
       </w:pPr>
       <w:r>
-        <w:t>I — ČINJENIČNI OSNOV</w:t>
+        <w:t>I — ЧИЊЕНИЧНИ ОСНОВ</w:t>
       </w:r>
     </w:p>
     <w:p>
@@ -176,16 +146,16 @@
         <w:ind w:left="425"/>
       </w:pPr>
       <w:r>
-        <w:t xml:space="preserve">1. Oštećeno privredno društvo „Vuković Commerce 2015" d.o.o. iz Veternika isključivi je vlasnik samohodne barže (motornog teretnjaka) </w:t>
+        <w:t xml:space="preserve">1. Оштећено прив. друштво VUKOVIĆ COMMERCE 2015 DOO VETERNIK искључиви је власник самоходне барже (моторног теретњака) </w:t>
       </w:r>
       <w:r>
         <w:rPr>
           <w:b/>
         </w:rPr>
-        <w:t>„BEČEJ I", ENI broj 36000187</w:t>
+        <w:t>„Бечеј I", ENI број 36000187</w:t>
       </w:r>
       <w:r>
-        <w:t>, upisane u uložak br. 2, na strani 9, sveske br. I Glavne knjige upisnika brodova unutrašnje plovidbe Lučke kapetanije Novi Sad. Pravo svojine oštećenog uknjiženo je Rešenjem LK Novi Sad broj 342-2/15 UBUP I od 03.09.2015. godine, što se dokazuje Izvodom Lučke kapetanije Novi Sad broj 342-1561/24-II od 09.09.2024. godine (prilog).</w:t>
+        <w:t>, уписане у уложак бр. 2, на страни 9, свеске бр. I Главне књиге уписника бродова унутрашње пловидбе Лучке капетаније Нови Сад. Право својине оштећеног укњижено је Решењем ЛК Нови Сад број 342-2/15 УБУП I од 03.09.2015. године, што се доказује Изводом Лучке капетаније Нови Сад број 342-1561/24-II од 09.09.2024. године (достављен уз допис од 24.09.2025. године).</w:t>
       </w:r>
     </w:p>
     <w:p>
@@ -193,25 +163,16 @@
         <w:ind w:left="425"/>
       </w:pPr>
       <w:r>
-        <w:t xml:space="preserve">2. Predmetno plovilo predato je na remont brodogradilištu </w:t>
-      </w:r>
-      <w:r>
-        <w:rPr>
-          <w:b/>
-        </w:rPr>
-        <w:t>„BEGEJ SHIPYARDS GROUP" d.o.o. Zrenjanin</w:t>
-      </w:r>
-      <w:r>
-        <w:t>, Temišvarski drum bb, Zrenjanin, MB: 21541575, PIB: 111793711 (pretežna delatnost: popravka i održavanje brodova i čamaca — šifra 3315), [</w:t>
+        <w:t>2. Предметни брод предат је на ремонт штетнику 1. реда — бродоградилишту BEGEJ SHIPYARDS GROUP DOO ZRENJANIN, чија је претежна регистрована делатност поправка и одржавање бродова и чамаца (шифра делатности 3315), [</w:t>
       </w:r>
       <w:r>
         <w:rPr>
           <w:i/>
         </w:rPr>
-        <w:t>upisati: broj i datum ugovora o remontu / radnog naloga, odnosno osnov predaje</w:t>
+        <w:t>уписати: број и датум уговора о ремонту / радног налога, односно основ предаје</w:t>
       </w:r>
       <w:r>
-        <w:t>], dana [____________] godine. Plovilo se nalazilo na lokalitetu Perlez, kod prevodnice Perlez.</w:t>
+        <w:t>], дана [____________] године. Брод се налазио на локалитету Перлез, код преводнице Перлез.</w:t>
       </w:r>
     </w:p>
     <w:p>
@@ -219,16 +180,16 @@
         <w:ind w:left="425"/>
       </w:pPr>
       <w:r>
-        <w:t xml:space="preserve">3. Za dan </w:t>
+        <w:t xml:space="preserve">3. За дан </w:t>
       </w:r>
       <w:r>
         <w:rPr>
           <w:b/>
         </w:rPr>
-        <w:t>11.09.2025. godine</w:t>
+        <w:t>11.09.2025. године</w:t>
       </w:r>
       <w:r>
-        <w:t xml:space="preserve"> bila je ugovorena primopredaja plovila po završenim radovima. Primopredaji su pristupili: Milan Mišić, advokat (punomoćnik oštećenog), Dejan Dimitrijević, zaposleni preduzeća „Begej Shipyards Group" d.o.o. Zrenjanin, i dr Milan Radošević, sudski veštak (po Rešenju Ministarstva pravde RS br. 740-05-02215/2014-22 od 08.12.2014. godine).</w:t>
+        <w:t xml:space="preserve"> била је уговорена примопредаја брода по завршеним радовима, на основу Понуде за Записник о преузимању брода, понуђене од стране штетника 1. и 2. реда (достављена уз допис од 24.09.2025. године). Примопредаји су приступили: адв. Милан Мишић (пуномоћник оштећеног), Дејан Димитријевић, запослени штетника 1. реда и др Милан Радошевић, судски вештак машинске струке (по Решењу Министарства правде РС бр. 740-05-02215/2014-22 од 08.12.2014. године).</w:t>
       </w:r>
     </w:p>
     <w:p>
@@ -236,16 +197,16 @@
         <w:ind w:left="425"/>
       </w:pPr>
       <w:r>
-        <w:t xml:space="preserve">4. Pregledom plovila na dan primopredaje utvrđeno je da je plovilo u neispravnom i nefunkcionalnom stanju — da su sa plovila otuđeni vitalni delovi i oprema i da je plovilo vandalizovano, o čemu je sudski veštak sačinio </w:t>
+        <w:t xml:space="preserve">4. Прегледом брода на дан примопредаје утврђено је да је брод у неисправном и нефункционалном стању — да су са брода отуђени витални делови и опрема и да је брод вандализован, о чему је судски вештак сачинио </w:t>
       </w:r>
       <w:r>
         <w:rPr>
           <w:b/>
         </w:rPr>
-        <w:t>Izveštaj o zatečenom stanju od 24.09.2025. godine</w:t>
+        <w:t>Извештај о затеченом стању од 24.09.2025. године</w:t>
       </w:r>
       <w:r>
-        <w:t xml:space="preserve"> sa fotodokumentacijom (prilog). Događaj je istog dana prijavljen nadležnoj policijskoj upravi, čiji su službenici izašli na lice mesta i izvršili uviđaj. Zaposleni „Begej Shipyards Group" d.o.o. napustili su mesto ugovorene primopredaje odmah po pozivanju policije, a pre dolaska policijskih službenika.</w:t>
+        <w:t xml:space="preserve"> са фотодокументацијом (достављен уз допис од 24.09.2025. године). Догађај је истог дана пријављен том органу, чији су службеници изашли на лице места и извршили увиђај. Запослени штетника 1. реда напустили су место уговорене примопредаје одмах по позивању полиције, а пре доласка полицијских службеника.</w:t>
       </w:r>
     </w:p>
     <w:p>
@@ -253,7 +214,7 @@
         <w:pStyle w:val="Heading2"/>
       </w:pPr>
       <w:r>
-        <w:t>II — IZJAŠNJENJE NA POSTAVLJENA PITANJA</w:t>
+        <w:t>II — ИЗЈАШЊЕЊЕ НА ПОСТАВЉЕНА ПИТАЊА</w:t>
       </w:r>
     </w:p>
     <w:p>
@@ -261,7 +222,7 @@
         <w:pStyle w:val="Heading3"/>
       </w:pPr>
       <w:r>
-        <w:t>1. Starost broda</w:t>
+        <w:t>1. Колико је брод стар</w:t>
       </w:r>
     </w:p>
     <w:p>
@@ -269,22 +230,22 @@
         <w:jc w:val="both"/>
       </w:pPr>
       <w:r>
-        <w:t xml:space="preserve">Brod „Bečej I" izgrađen je </w:t>
+        <w:t xml:space="preserve">Брод „Бечеј I" изграђен је </w:t>
       </w:r>
       <w:r>
         <w:rPr>
           <w:b/>
         </w:rPr>
-        <w:t>1978. godine</w:t>
+        <w:t>1978. године</w:t>
       </w:r>
       <w:r>
-        <w:t xml:space="preserve"> u brodogradilištu Balatonfüred, Mađarska (list A upisnika brodova). Na dan ugovorene primopredaje (11.09.2025. godine) brod je bio star </w:t>
+        <w:t xml:space="preserve"> у бродоградилишту Balatonfüred, Мађарска (лист А уписника бродова). На дан уговорене примопредаје (11.09.2025. године) брод је био стар </w:t>
       </w:r>
       <w:r>
         <w:rPr>
           <w:b/>
         </w:rPr>
-        <w:t>47 godina</w:t>
+        <w:t>47 година</w:t>
       </w:r>
       <w:r>
         <w:t>.</w:t>
@@ -295,7 +256,7 @@
         <w:jc w:val="both"/>
       </w:pPr>
       <w:r>
-        <w:t>Osnovne karakteristike broda prema upisniku: motorni teretnjak sa sopstvenim pogonom; najveća nosivost 886,00 t; dva dizel motora ukupne snage 212,20 kW; dva (2) Z pogona; trup od čelika; najveća dužina 69,71 m; najveća širina 8,62 m.</w:t>
+        <w:t>Основне карактеристике брода према уписнику: моторни теретњак са сопственим погоном; највећа носивост 886,00 т; два дизел мотора укупне снаге 212,20 kW; два (2) Z погона; труп од челика; највећа дужина 69,71 м; највећа ширина 8,62 м.</w:t>
       </w:r>
     </w:p>
     <w:p>
@@ -303,7 +264,7 @@
         <w:pStyle w:val="Heading3"/>
       </w:pPr>
       <w:r>
-        <w:t>2. Starost otuđenih delova</w:t>
+        <w:t>2. Колико су стари отуђени делови</w:t>
       </w:r>
     </w:p>
     <w:p>
@@ -311,16 +272,16 @@
         <w:jc w:val="both"/>
       </w:pPr>
       <w:r>
-        <w:t>Otuđeni delovi i oprema bili su ugrađeni i u funkciji u trenutku predaje plovila na remont. Starost pojedinih delova odgovara godini gradnje broda (1978), dok su pojedini delovi i oprema naknadno ugrađeni, i to: [</w:t>
+        <w:t>Отуђени делови и опрема били су уграђени и у функцији у тренутку предаје брода на ремонт. Старост појединих делова одговара години градње брода (1978), док су поједини делови и опрема накнадно уграђени, и то: [</w:t>
       </w:r>
       <w:r>
         <w:rPr>
           <w:i/>
         </w:rPr>
-        <w:t>upisati — npr. radar, radio stanica, agregat: godina nabavke/ugradnje, računi/dokumentacija ukoliko postoje</w:t>
+        <w:t>уписати — нпр. радар, радио станица, агрегат: година набавке/уградње, рачуни/документација уколико постоје</w:t>
       </w:r>
       <w:r>
-        <w:t>]. Tačna starost i stanje svakog pojedinačnog dela biće utvrđeni veštačenjem, odnosno celokupnom defektažom plovila od strane servisera mašinske i elektro struke, kako je konstatovano u izveštaju sudskog veštaka.</w:t>
+        <w:t>]. Тачна старост и стање сваког појединачног дела биће утврђени вештачењем, односно целокупном дефектажом брода од стране сервисера машинске и електро струке, како је констатовано у извештају судског вештака.</w:t>
       </w:r>
     </w:p>
     <w:p>
@@ -328,7 +289,7 @@
         <w:pStyle w:val="Heading3"/>
       </w:pPr>
       <w:r>
-        <w:t>3. Kome je brod ostavljen na remont</w:t>
+        <w:t>3. Коме је брод остављен на ремонт</w:t>
       </w:r>
     </w:p>
     <w:p>
@@ -336,25 +297,16 @@
         <w:jc w:val="both"/>
       </w:pPr>
       <w:r>
-        <w:t xml:space="preserve">Brod je ostavljen na remont brodogradilištu </w:t>
+        <w:t xml:space="preserve">Брод је остављен на ремонт штетнику 1. реда — бродоградилишту </w:t>
       </w:r>
       <w:r>
         <w:rPr>
           <w:b/>
         </w:rPr>
-        <w:t>„BEGEJ SHIPYARDS GROUP" d.o.o. Zrenjanin</w:t>
+        <w:t>BEGEJ SHIPYARDS GROUP DOO ZRENJANIN</w:t>
       </w:r>
       <w:r>
-        <w:t>, sa sedištem na adresi Temišvarski drum bb, Zrenjanin, MB: 21541575, PIB: 111793711, čija je pretežna registrovana delatnost popravka i održavanje brodova i čamaca (šifra delatnosti 3315), [</w:t>
-      </w:r>
-      <w:r>
-        <w:rPr>
-          <w:i/>
-        </w:rPr>
-        <w:t>upisati: broj i datum ugovora o remontu, odnosno osnov predaje; datum predaje plovila</w:t>
-      </w:r>
-      <w:r>
-        <w:t>]. Plovilo je od predaje do dana ugovorene primopredaje bilo u državini i pod nadzorom navedenog privrednog društva.</w:t>
+        <w:t>, ул. Темишварски друм ББ, Зрењанин, МБ: 21541575, ПИБ: 111793711. Брод је од предаје до дана уговорене примопредаје био у државини и под надзором штетника 1. реда, који као професионално бродоградилиште одговара за поверену ствар по повишеном стандарду пажње доброг стручњака (чл. 18. ст. 2. ЗОО).</w:t>
       </w:r>
     </w:p>
     <w:p>
@@ -362,7 +314,7 @@
         <w:pStyle w:val="Heading3"/>
       </w:pPr>
       <w:r>
-        <w:t>4. Ko je trebalo da izvrši primopredaju broda po završenim radovima</w:t>
+        <w:t>4. Ко је требало да изврши примопредају брода по завршеним радовима</w:t>
       </w:r>
     </w:p>
     <w:p>
@@ -370,25 +322,16 @@
         <w:jc w:val="both"/>
       </w:pPr>
       <w:r>
-        <w:t xml:space="preserve">Primopredaju broda po završenim radovima trebalo je da izvrši </w:t>
+        <w:t xml:space="preserve">Примопредају брода по завршеним радовима требало је да изврше </w:t>
       </w:r>
       <w:r>
         <w:rPr>
           <w:b/>
         </w:rPr>
-        <w:t>„BEGEJ SHIPYARDS GROUP" d.o.o. Zrenjanin</w:t>
+        <w:t>штетници 1. и 2. реда</w:t>
       </w:r>
       <w:r>
-        <w:t xml:space="preserve"> (MB: 21541575, PIB: 111793711), kao izvođač radova kome je plovilo povereno, preko svog odgovornog lica [</w:t>
-      </w:r>
-      <w:r>
-        <w:rPr>
-          <w:i/>
-        </w:rPr>
-        <w:t>upisati ime i funkciju odgovornog lica / lica određenog za primopredaju</w:t>
-      </w:r>
-      <w:r>
-        <w:t>], a oštećenom kao vlasniku plovila. Primopredaja je bila ugovorena za 11.09.2025. godine na lokalitetu Perlez i nije izvršena iz razloga navedenih u tački I.4. ovog podneska.</w:t>
+        <w:t xml:space="preserve"> — BEGEJ SHIPYARDS GROUP DOO ZRENJANIN, преко директора Душка Топаловића, који су оштећеном и понудили Записник о преузимању брода, са примопредајом заказаном за дан 11.09.2025. године. Примопредаја није извршена из разлога наведених у тачки I.4. овог изјашњења.</w:t>
       </w:r>
     </w:p>
     <w:p>
@@ -396,7 +339,7 @@
         <w:pStyle w:val="Heading2"/>
       </w:pPr>
       <w:r>
-        <w:t>III — TAKSATIVNI POPIS OTUĐENIH I OŠTEĆENIH STVARI</w:t>
+        <w:t>III — ТАКСАТИВНИ ПОПИС ОТУЂЕНИХ И ОШТЕЋЕНИХ СТВАРИ</w:t>
       </w:r>
     </w:p>
     <w:p>
@@ -404,7 +347,7 @@
         <w:jc w:val="both"/>
       </w:pPr>
       <w:r>
-        <w:t>Na osnovu Izveštaja o zatečenom stanju sudskog veštaka dr Milana Radoševića od 24.09.2025. godine sa fotodokumentacijom, taksativno se popisuju:</w:t>
+        <w:t>На основу Извештаја о затеченом стању судског вештака др Милана Радошевића од 24.09.2025. године са фотодокументацијом, таксативно се пописују:</w:t>
       </w:r>
     </w:p>
     <w:p>
@@ -412,7 +355,7 @@
         <w:pStyle w:val="Heading3"/>
       </w:pPr>
       <w:r>
-        <w:t>A) Otuđene stvari (nedostaju, odnosno pokradene su sa plovila)</w:t>
+        <w:t>А) Отуђене ствари (недостају, односно покрадене су са брода)</w:t>
       </w:r>
     </w:p>
     <w:p>
@@ -420,7 +363,7 @@
         <w:ind w:left="425"/>
       </w:pPr>
       <w:r>
-        <w:t>1. brodski agregat;</w:t>
+        <w:t>1. бродски агрегат;</w:t>
       </w:r>
     </w:p>
     <w:p>
@@ -428,7 +371,7 @@
         <w:ind w:left="425"/>
       </w:pPr>
       <w:r>
-        <w:t>2. radar;</w:t>
+        <w:t>2. радар;</w:t>
       </w:r>
     </w:p>
     <w:p>
@@ -436,7 +379,7 @@
         <w:ind w:left="425"/>
       </w:pPr>
       <w:r>
-        <w:t>3. radio stanica;</w:t>
+        <w:t>3. радио станица;</w:t>
       </w:r>
     </w:p>
     <w:p>
@@ -444,7 +387,7 @@
         <w:ind w:left="425"/>
       </w:pPr>
       <w:r>
-        <w:t>4. dva (2) brodska propulzera marke „Schottel" sa celokupnim pripadajućim sistemom — dva Z pogona (sredstvo poriva/pogona plovila);</w:t>
+        <w:t>4. два (2) бродска пропулзера марке „Schottel" са целокупним припадајућим системом — два Z погона (средство порива/погона брода);</w:t>
       </w:r>
     </w:p>
     <w:p>
@@ -452,7 +395,7 @@
         <w:ind w:left="425"/>
       </w:pPr>
       <w:r>
-        <w:t>5. razvodni ormani (pokradeni, sa isečenom električnom instalacijom);</w:t>
+        <w:t>5. разводни ормани (покрадени, са исеченом електричном инсталацијом);</w:t>
       </w:r>
     </w:p>
     <w:p>
@@ -460,7 +403,7 @@
         <w:ind w:left="425"/>
       </w:pPr>
       <w:r>
-        <w:t>6. spojni elementi od pogonskog agregata do propulzera (pokradeni);</w:t>
+        <w:t>6. спојни елементи од погонског агрегата до пропулзера (покрадени);</w:t>
       </w:r>
     </w:p>
     <w:p>
@@ -468,7 +411,7 @@
         <w:ind w:left="425"/>
       </w:pPr>
       <w:r>
-        <w:t>7. glava motora jednog pogonskog agregata (skinuta sa motora).</w:t>
+        <w:t>7. глава мотора једног погонског агрегата (скинута са мотора).</w:t>
       </w:r>
     </w:p>
     <w:p>
@@ -476,7 +419,7 @@
         <w:pStyle w:val="Heading3"/>
       </w:pPr>
       <w:r>
-        <w:t>B) Oštećene, odnosno uništene stvari</w:t>
+        <w:t>Б) Оштећене, односно уништене ствари</w:t>
       </w:r>
     </w:p>
     <w:p>
@@ -484,7 +427,7 @@
         <w:ind w:left="425"/>
       </w:pPr>
       <w:r>
-        <w:t>1. brodska kabina (oštećena);</w:t>
+        <w:t>1. бродска кабина (оштећена);</w:t>
       </w:r>
     </w:p>
     <w:p>
@@ -492,7 +435,7 @@
         <w:ind w:left="425"/>
       </w:pPr>
       <w:r>
-        <w:t>2. vrata kabine (oštećena);</w:t>
+        <w:t>2. врата кабине (оштећена);</w:t>
       </w:r>
     </w:p>
     <w:p>
@@ -500,7 +443,7 @@
         <w:ind w:left="425"/>
       </w:pPr>
       <w:r>
-        <w:t>3. električna instalacija plovila (isečena);</w:t>
+        <w:t>3. електрична инсталација брода (исечена);</w:t>
       </w:r>
     </w:p>
     <w:p>
@@ -508,7 +451,7 @@
         <w:ind w:left="425"/>
       </w:pPr>
       <w:r>
-        <w:t>4. brodske kabine — stambeni prostor (vandalizovan);</w:t>
+        <w:t>4. бродске кабине — стамбени простор (вандализован);</w:t>
       </w:r>
     </w:p>
     <w:p>
@@ -516,7 +459,7 @@
         <w:ind w:left="425"/>
       </w:pPr>
       <w:r>
-        <w:t>5. mašinski prostor (oštećen);</w:t>
+        <w:t>5. машински простор (оштећен);</w:t>
       </w:r>
     </w:p>
     <w:p>
@@ -524,7 +467,7 @@
         <w:ind w:left="425"/>
       </w:pPr>
       <w:r>
-        <w:t>6. jedan pogonski agregat — motor (oštećen skidanjem glave motora);</w:t>
+        <w:t>6. један погонски агрегат — мотор (оштећен скидањем главе мотора);</w:t>
       </w:r>
     </w:p>
     <w:p>
@@ -532,7 +475,7 @@
         <w:ind w:left="425"/>
       </w:pPr>
       <w:r>
-        <w:t>7. hidraulična instalacija u mašinskom prostoru (isečena).</w:t>
+        <w:t>7. хидраулична инсталација у машинском простору (исечена).</w:t>
       </w:r>
     </w:p>
     <w:p>
@@ -540,7 +483,7 @@
         <w:jc w:val="both"/>
       </w:pPr>
       <w:r>
-        <w:t>Sve napred navedeno fotografisano je na dan primopredaje i dokumentovano u fotodokumentaciji koja čini sastavni deo izveštaja sudskog veštaka.</w:t>
+        <w:t>Све напред наведено фотографисано је на дан примопредаје и документовано у фотодокументацији која чини саставни део извештаја судског вештака.</w:t>
       </w:r>
     </w:p>
     <w:p>
@@ -548,7 +491,7 @@
         <w:pStyle w:val="Heading2"/>
       </w:pPr>
       <w:r>
-        <w:t>IV — ODŠTETNI ZAHTEV (IMOVINSKOPRAVNI ZAHTEV)</w:t>
+        <w:t>IV — ПРЕЦИЗИРАНИ ОДШТЕТНИ ЗАХТЕВ</w:t>
       </w:r>
     </w:p>
     <w:p>
@@ -556,7 +499,16 @@
         <w:jc w:val="both"/>
       </w:pPr>
       <w:r>
-        <w:t>Na ime štete prouzrokovane izvršenjem krivičnog dela, oštećeni, saglasno čl. 252–256. Zakonika o krivičnom postupku, a u vezi sa čl. 154, 155, 185, 186, 189. i 395. Zakona o obligacionim odnosima, ističe imovinskopravni zahtev, i to:</w:t>
+        <w:t xml:space="preserve">Одштетни захтев истакнут дописом пуномоћника оштећеног од 24.09.2025. године овим се </w:t>
+      </w:r>
+      <w:r>
+        <w:rPr>
+          <w:b/>
+        </w:rPr>
+        <w:t>прецизира</w:t>
+      </w:r>
+      <w:r>
+        <w:t>, тако да се на име штете проузроковане извршењем кривичног дела, сагласно чл. 252–256. Законика о кривичном поступку, а у вези са чл. 154, 155, 185, 186, 189. и 395. Закона о облигационим односима, према штетницима 1. и 2. реда истиче одштетни захтев, и то:</w:t>
       </w:r>
     </w:p>
     <w:tbl>
@@ -576,7 +528,7 @@
           </w:tcPr>
           <w:p>
             <w:r>
-              <w:t>Vid štete</w:t>
+              <w:t>Вид штете</w:t>
             </w:r>
           </w:p>
         </w:tc>
@@ -586,7 +538,7 @@
           </w:tcPr>
           <w:p>
             <w:r>
-              <w:t>Iznos</w:t>
+              <w:t>Износ</w:t>
             </w:r>
           </w:p>
         </w:tc>
@@ -602,10 +554,10 @@
               <w:rPr>
                 <w:b/>
               </w:rPr>
-              <w:t>Obična (stvarna) šteta</w:t>
+              <w:t>Обична (стварна) штета</w:t>
             </w:r>
             <w:r>
-              <w:t xml:space="preserve"> — vrednost otuđenih stvari iz tačke III/A i troškovi popravke oštećenih stvari iz tačke III/B</w:t>
+              <w:t xml:space="preserve"> — вредност отуђених ствари из тачке III/А и трошкови поправке оштећених ствари из тачке III/Б</w:t>
             </w:r>
           </w:p>
         </w:tc>
@@ -619,7 +571,7 @@
               <w:rPr>
                 <w:b/>
               </w:rPr>
-              <w:t>400.000,00 EUR</w:t>
+              <w:t>400.000,00 евра</w:t>
             </w:r>
             <w:r/>
           </w:p>
@@ -636,10 +588,10 @@
               <w:rPr>
                 <w:b/>
               </w:rPr>
-              <w:t>Izgubljena dobit (izmakla korist)</w:t>
+              <w:t>Изгубљена добит (измакла корист)</w:t>
             </w:r>
             <w:r>
-              <w:t xml:space="preserve"> — dobit koju je oštećeni osnovano očekivao od privrednog iskorišćavanja plovila (prevoz tereta), a koja je izostala usled potpune nefunkcionalnosti plovila</w:t>
+              <w:t xml:space="preserve"> — добит коју је оштећени основано очекивао од привредног искоришћавања брода (превоз терета), а која је изостала услед потпуне нефункционалности брода</w:t>
             </w:r>
           </w:p>
         </w:tc>
@@ -653,7 +605,7 @@
               <w:rPr>
                 <w:b/>
               </w:rPr>
-              <w:t>800.000,00 EUR</w:t>
+              <w:t>800.000,00 евра</w:t>
             </w:r>
             <w:r/>
           </w:p>
@@ -670,7 +622,7 @@
               <w:rPr>
                 <w:b/>
               </w:rPr>
-              <w:t>UKUPNO</w:t>
+              <w:t>УКУПНО</w:t>
             </w:r>
             <w:r/>
           </w:p>
@@ -685,9 +637,11 @@
               <w:rPr>
                 <w:b/>
               </w:rPr>
-              <w:t>1.200.000,00 EUR</w:t>
+              <w:t>1.200.000,00 евра</w:t>
             </w:r>
-            <w:r/>
+            <w:r>
+              <w:t xml:space="preserve"> (словима: милион и двеста хиљада евра)</w:t>
+            </w:r>
           </w:p>
         </w:tc>
       </w:tr>
@@ -697,7 +651,7 @@
         <w:jc w:val="both"/>
       </w:pPr>
       <w:r>
-        <w:t>sve u dinarskoj protivvrednosti po srednjem kursu Narodne banke Srbije na dan isplate, sa zakonskom zateznom kamatom od dana izvršenja krivičnog dela do isplate.</w:t>
+        <w:t>све у динарској противвредности по продајном курсу НБС на дан исплате, са законском затезном каматом од дана извршења кривичног дела до исплате.</w:t>
       </w:r>
     </w:p>
     <w:p>
@@ -705,13 +659,13 @@
         <w:jc w:val="both"/>
       </w:pPr>
       <w:r>
-        <w:t>Izgubljena dobit obračunata je polazeći od [</w:t>
+        <w:t>Изгубљена добит обрачуната је полазећи од [</w:t>
       </w:r>
       <w:r>
         <w:rPr>
           <w:i/>
         </w:rPr>
-        <w:t>upisati: ugovori o prevozu / pisma o namerama / prosečna dnevna vozarina za plovilo navedene nosivosti × broj dana van eksploatacije — dokumentacija će biti naknadno dostavljena</w:t>
+        <w:t>уписати: уговори о превозу / писма о намерама / просечна дневна возарина за брод наведене носивости × број дана ван експлоатације — документација ће бити накнадно достављена</w:t>
       </w:r>
       <w:r>
         <w:t>].</w:t>
@@ -726,10 +680,10 @@
         <w:rPr>
           <w:b/>
         </w:rPr>
-        <w:t>Napomena o vrednosti pojedinačnih stvari:</w:t>
+        <w:t>Напомена о вредности појединачних ствари:</w:t>
       </w:r>
       <w:r>
-        <w:t xml:space="preserve"> vrednost svake pojedinačne otuđene, odnosno oštećene stvari iz tačke III biće precizno utvrđena celokupnom defektažom plovila od strane servisera mašinske i elektro struke i veštačenjem ekonomsko-finansijske, odnosno mašinske struke, kako je konstatovano u izveštaju sudskog veštaka. Oštećeni zadržava pravo da odštetni zahtev precizira, odnosno izmeni po izvršenoj defektaži i veštačenju, kao i da deo zahteva ostvaruje u parničnom postupku (čl. 252. st. 2. i čl. 258. ZKP).</w:t>
+        <w:t xml:space="preserve"> вредност сваке појединачне отуђене, односно оштећене ствари из тачке III биће прецизно утврђена целокупном дефектажом брода од стране сервисера машинске и електро струке и вештачењем одговарајуће струке, како је констатовано у извештају судског вештака. Оштећени задржава право да одштетни захтев прецизира, односно измени по извршеној дефектажи и вештачењу, као и да део захтева остварује у парничном поступку (чл. 252. ст. 2. и чл. 258. ЗКП).</w:t>
       </w:r>
     </w:p>
     <w:p>
@@ -737,7 +691,7 @@
         <w:pStyle w:val="Heading2"/>
       </w:pPr>
       <w:r>
-        <w:t>V — PREDLOG</w:t>
+        <w:t>V — ПРЕДЛОГ</w:t>
       </w:r>
     </w:p>
     <w:p>
@@ -745,7 +699,7 @@
         <w:jc w:val="both"/>
       </w:pPr>
       <w:r>
-        <w:t>Predlaže se da postupajući organ:</w:t>
+        <w:t>Предлаже се да поступајући орган:</w:t>
       </w:r>
     </w:p>
     <w:p>
@@ -753,7 +707,7 @@
         <w:ind w:left="425"/>
       </w:pPr>
       <w:r>
-        <w:t>1. primi ovo izjašnjenje i odštetni zahtev u spise predmeta i o njemu obavesti nadležno javno tužilaštvo;</w:t>
+        <w:t>1. прими ово изјашњење и прецизирани одштетни захтев у списе предмета и о њему обавести надлежно јавно тужилаштво;</w:t>
       </w:r>
     </w:p>
     <w:p>
@@ -761,7 +715,7 @@
         <w:ind w:left="425"/>
       </w:pPr>
       <w:r>
-        <w:t>2. od „Begej Shipyards Group" d.o.o. Zrenjanin pribavi dokumentaciju o prijemu plovila na remont, izvedenim radovima i licima koja su imala pristup plovilu;</w:t>
+        <w:t>2. од штетника 1. реда прибави документацију о пријему брода на ремонт, изведеним радовима и лицима која су имала приступ броду;</w:t>
       </w:r>
     </w:p>
     <w:p>
@@ -769,7 +723,7 @@
         <w:ind w:left="425"/>
       </w:pPr>
       <w:r>
-        <w:t>3. preduzme mere iz svoje nadležnosti radi pronalaska otuđenih stvari (posebno dva propulzera „Schottel", radara, radio stanice i agregata) i identifikovanja izvršilaca;</w:t>
+        <w:t>3. предузме мере из своје надлежности ради проналаска отуђених ствари (посебно два пропулзера „Schottel", радара, радио станице и агрегата) и идентификовања извршилаца;</w:t>
       </w:r>
     </w:p>
     <w:p>
@@ -777,7 +731,7 @@
         <w:ind w:left="425"/>
       </w:pPr>
       <w:r>
-        <w:t>4. o preduzetim merama obavesti oštećenog preko punomoćnika.</w:t>
+        <w:t>4. о предузетим мерама обавести оштећеног преко пуномоћника.</w:t>
       </w:r>
     </w:p>
     <w:p>
@@ -785,7 +739,15 @@
         <w:pStyle w:val="Heading2"/>
       </w:pPr>
       <w:r>
-        <w:t>PRILOZI</w:t>
+        <w:t>ДОКАЗИ</w:t>
+      </w:r>
+    </w:p>
+    <w:p>
+      <w:pPr>
+        <w:jc w:val="both"/>
+      </w:pPr>
+      <w:r>
+        <w:t>Достављени уз допис пуномоћника оштећеног од 24.09.2025. године:</w:t>
       </w:r>
     </w:p>
     <w:p>
@@ -793,7 +755,7 @@
         <w:ind w:left="425"/>
       </w:pPr>
       <w:r>
-        <w:t>1. Izvod iz Glavne knjige upisnika brodova unutrašnje plovidbe, LK Novi Sad, br. 342-1561/24-II od 09.09.2024. godine;</w:t>
+        <w:t>1. Бродско сведочанство Републике Србије за предметни брод;</w:t>
       </w:r>
     </w:p>
     <w:p>
@@ -801,7 +763,7 @@
         <w:ind w:left="425"/>
       </w:pPr>
       <w:r>
-        <w:t>2. Izveštaj o zatečenom stanju sudskog veštaka dr Milana Radoševića od 24.09.2025. godine sa fotodokumentacijom;</w:t>
+        <w:t>2. Извод Лучке капетаније Нови Сад за предметни брод;</w:t>
       </w:r>
     </w:p>
     <w:p>
@@ -809,16 +771,7 @@
         <w:ind w:left="425"/>
       </w:pPr>
       <w:r>
-        <w:t>3. Ugovor o remontu / radni nalog [</w:t>
-      </w:r>
-      <w:r>
-        <w:rPr>
-          <w:i/>
-        </w:rPr>
-        <w:t>dostaviti — upisati</w:t>
-      </w:r>
-      <w:r>
-        <w:t>];</w:t>
+        <w:t>3. Понуда за Записник о преузимању брода, заказану за дан 11.09.2025. године, понуђен од стране штетника 1. и 2. реда;</w:t>
       </w:r>
     </w:p>
     <w:p>
@@ -826,7 +779,7 @@
         <w:ind w:left="425"/>
       </w:pPr>
       <w:r>
-        <w:t>4. Punomoćje;</w:t>
+        <w:t>4. Извештај о затеченом стању предметног брода на дан 11.09.2025. године, израђен од стране судског вештака машинске струке др Милана Радошевића из Новог Сада;</w:t>
       </w:r>
     </w:p>
     <w:p>
@@ -834,16 +787,7 @@
         <w:ind w:left="425"/>
       </w:pPr>
       <w:r>
-        <w:t>5. [</w:t>
-      </w:r>
-      <w:r>
-        <w:rPr>
-          <w:i/>
-        </w:rPr>
-        <w:t>ostala dokumentacija — upisati</w:t>
-      </w:r>
-      <w:r>
-        <w:t>].</w:t>
+        <w:t>5. пуномоћ.</w:t>
       </w:r>
     </w:p>
     <w:p>
@@ -851,7 +795,23 @@
         <w:jc w:val="both"/>
       </w:pPr>
       <w:r>
-        <w:t>U [___________], dana [____.____.2026.] godine</w:t>
+        <w:t>За кореспонденцију: адв. Милан Мишић, Нови Сад, Максима Горког бр. 6, моб. телефон: 064/0327-019, мејл: milan.misic.advokat@gmail.com</w:t>
+      </w:r>
+    </w:p>
+    <w:p>
+      <w:pPr>
+        <w:jc w:val="both"/>
+      </w:pPr>
+      <w:r>
+        <w:t>Нови Сад,</w:t>
+      </w:r>
+    </w:p>
+    <w:p>
+      <w:pPr>
+        <w:jc w:val="both"/>
+      </w:pPr>
+      <w:r>
+        <w:t>дана [____.____.2026.] године</w:t>
       </w:r>
     </w:p>
     <w:p>
@@ -863,36 +823,7 @@
         <w:rPr>
           <w:b/>
         </w:rPr>
-        <w:t>OŠTEĆENI</w:t>
-      </w:r>
-      <w:r/>
-    </w:p>
-    <w:p>
-      <w:pPr>
-        <w:jc w:val="both"/>
-      </w:pPr>
-      <w:r>
-        <w:t>„Vuković Commerce 2015" d.o.o., Veternik</w:t>
-      </w:r>
-    </w:p>
-    <w:p>
-      <w:pPr>
-        <w:jc w:val="both"/>
-      </w:pPr>
-      <w:r>
-        <w:t>po punomoćniku:</w:t>
-      </w:r>
-    </w:p>
-    <w:p>
-      <w:pPr>
-        <w:jc w:val="both"/>
-      </w:pPr>
-      <w:r/>
-      <w:r>
-        <w:rPr>
-          <w:b/>
-        </w:rPr>
-        <w:t>Milan Mišić, advokat</w:t>
+        <w:t>адв. Милан Мишић</w:t>
       </w:r>
       <w:r/>
     </w:p>

</xml_diff>

<commit_message>
docs: odštetni zahtev ostaje 1.500.000 EUR, vidovi štete kao minimumi
</commit_message>
<xml_diff>
--- a/izvestaj/Podnesak_MUP_Zrenjanin_izjasnjenje.docx
+++ b/izvestaj/Podnesak_MUP_Zrenjanin_izjasnjenje.docx
@@ -106,7 +106,7 @@
         <w:jc w:val="center"/>
       </w:pPr>
       <w:r>
-        <w:t>ИЗЈАШЊЕЊЕ ПУНОМОЋНИКА ОШТЕЋЕНОГ НА ОКОЛНОСТИ ВРЕДНОСТИ ОТУЂЕНИХ СТВАРИ — ТАКСАТИВНИ ПОПИС ОТУЂЕНИХ И ОШТЕЋЕНИХ СТВАРИ — СА ПРЕЦИЗИРАНИМ ОДШТЕТНИМ ЗАХТЕВОМ</w:t>
+        <w:t>ИЗЈАШЊЕЊЕ ПУНОМОЋНИКА ОШТЕЋЕНОГ НА ОКОЛНОСТИ ВРЕДНОСТИ ОТУЂЕНИХ СТВАРИ — ТАКСАТИВНИ ПОПИС ОТУЂЕНИХ И ОШТЕЋЕНИХ СТВАРИ — СА ОДШТЕТНИМ ЗАХТЕВОМ</w:t>
       </w:r>
     </w:p>
     <w:p>
@@ -491,7 +491,7 @@
         <w:pStyle w:val="Heading2"/>
       </w:pPr>
       <w:r>
-        <w:t>IV — ПРЕЦИЗИРАНИ ОДШТЕТНИ ЗАХТЕВ</w:t>
+        <w:t>IV — ОДШТЕТНИ ЗАХТЕВ</w:t>
       </w:r>
     </w:p>
     <w:p>
@@ -499,16 +499,33 @@
         <w:jc w:val="both"/>
       </w:pPr>
       <w:r>
-        <w:t xml:space="preserve">Одштетни захтев истакнут дописом пуномоћника оштећеног од 24.09.2025. године овим се </w:t>
+        <w:t xml:space="preserve">Оштећени </w:t>
       </w:r>
       <w:r>
         <w:rPr>
           <w:b/>
         </w:rPr>
-        <w:t>прецизира</w:t>
+        <w:t>остаје при одштетном захтеву</w:t>
       </w:r>
       <w:r>
-        <w:t>, тако да се на име штете проузроковане извршењем кривичног дела, сагласно чл. 252–256. Законика о кривичном поступку, а у вези са чл. 154, 155, 185, 186, 189. и 395. Закона о облигационим односима, према штетницима 1. и 2. реда истиче одштетни захтев, и то:</w:t>
+        <w:t xml:space="preserve"> истакнутом дописом пуномоћника оштећеног од 24.09.2025. године, у износу од </w:t>
+      </w:r>
+      <w:r>
+        <w:rPr>
+          <w:b/>
+        </w:rPr>
+        <w:t>1.500.000,00 евра (словима: милион и по евра)</w:t>
+      </w:r>
+      <w:r>
+        <w:t xml:space="preserve"> у динарској противвредности по продајном курсу НБС на дан исплате, према штетницима 1. и 2. реда, сагласно чл. 252–256. Законика о кривичном поступку, а у вези са чл. 154, 155, 185, 186, 189. и 395. Закона о облигационим односима, са законском затезном каматом од дана извршења кривичног дела до исплате.</w:t>
+      </w:r>
+    </w:p>
+    <w:p>
+      <w:pPr>
+        <w:jc w:val="both"/>
+      </w:pPr>
+      <w:r>
+        <w:t>У оквиру наведеног укупног износа, по видовима штете, изјашњавамо се:</w:t>
       </w:r>
     </w:p>
     <w:tbl>
@@ -566,7 +583,9 @@
             <w:tcW w:type="dxa" w:w="4703"/>
           </w:tcPr>
           <w:p>
-            <w:r/>
+            <w:r>
+              <w:t xml:space="preserve">најмање </w:t>
+            </w:r>
             <w:r>
               <w:rPr>
                 <w:b/>
@@ -591,7 +610,7 @@
               <w:t>Изгубљена добит (измакла корист)</w:t>
             </w:r>
             <w:r>
-              <w:t xml:space="preserve"> — добит коју је оштећени основано очекивао од привредног искоришћавања брода (превоз терета), а која је изостала услед потпуне нефункционалности брода</w:t>
+              <w:t xml:space="preserve"> — добит коју је оштећени основано очекивао од привредног искоришћавања брода (превоз терета), а која је изостала услед потпуне нефункционалности брода, рачунајући и даљи изостанак експлоатације до оспособљавања брода</w:t>
             </w:r>
           </w:p>
         </w:tc>
@@ -600,7 +619,9 @@
             <w:tcW w:type="dxa" w:w="4703"/>
           </w:tcPr>
           <w:p>
-            <w:r/>
+            <w:r>
+              <w:t xml:space="preserve">најмање </w:t>
+            </w:r>
             <w:r>
               <w:rPr>
                 <w:b/>
@@ -637,23 +658,15 @@
               <w:rPr>
                 <w:b/>
               </w:rPr>
-              <w:t>1.200.000,00 евра</w:t>
+              <w:t>1.500.000,00 евра</w:t>
             </w:r>
             <w:r>
-              <w:t xml:space="preserve"> (словима: милион и двеста хиљада евра)</w:t>
+              <w:t xml:space="preserve"> (словима: милион и по евра)</w:t>
             </w:r>
           </w:p>
         </w:tc>
       </w:tr>
     </w:tbl>
-    <w:p>
-      <w:pPr>
-        <w:jc w:val="both"/>
-      </w:pPr>
-      <w:r>
-        <w:t>све у динарској противвредности по продајном курсу НБС на дан исплате, са законском затезном каматом од дана извршења кривичног дела до исплате.</w:t>
-      </w:r>
-    </w:p>
     <w:p>
       <w:pPr>
         <w:jc w:val="both"/>
@@ -707,7 +720,7 @@
         <w:ind w:left="425"/>
       </w:pPr>
       <w:r>
-        <w:t>1. прими ово изјашњење и прецизирани одштетни захтев у списе предмета и о њему обавести надлежно јавно тужилаштво;</w:t>
+        <w:t>1. прими ово изјашњење и одштетни захтев у списе предмета и о њему обавести надлежно јавно тужилаштво;</w:t>
       </w:r>
     </w:p>
     <w:p>

</xml_diff>

<commit_message>
docs: vidovi štete 600.000 + 900.000 = 1.500.000 EUR
</commit_message>
<xml_diff>
--- a/izvestaj/Podnesak_MUP_Zrenjanin_izjasnjenje.docx
+++ b/izvestaj/Podnesak_MUP_Zrenjanin_izjasnjenje.docx
@@ -525,7 +525,7 @@
         <w:jc w:val="both"/>
       </w:pPr>
       <w:r>
-        <w:t>У оквиру наведеног укупног износа, по видовима штете, изјашњавамо се:</w:t>
+        <w:t>По видовима штете, изјашњавамо се:</w:t>
       </w:r>
     </w:p>
     <w:tbl>
@@ -583,14 +583,12 @@
             <w:tcW w:type="dxa" w:w="4703"/>
           </w:tcPr>
           <w:p>
-            <w:r>
-              <w:t xml:space="preserve">најмање </w:t>
-            </w:r>
+            <w:r/>
             <w:r>
               <w:rPr>
                 <w:b/>
               </w:rPr>
-              <w:t>400.000,00 евра</w:t>
+              <w:t>600.000,00 евра</w:t>
             </w:r>
             <w:r/>
           </w:p>
@@ -619,14 +617,12 @@
             <w:tcW w:type="dxa" w:w="4703"/>
           </w:tcPr>
           <w:p>
-            <w:r>
-              <w:t xml:space="preserve">најмање </w:t>
-            </w:r>
+            <w:r/>
             <w:r>
               <w:rPr>
                 <w:b/>
               </w:rPr>
-              <w:t>800.000,00 евра</w:t>
+              <w:t>900.000,00 евра</w:t>
             </w:r>
             <w:r/>
           </w:p>

</xml_diff>

<commit_message>
docs: izgubljena dobit 1.000.000 EUR (2.000 EUR/dan), ukupno 1.600.000; uklonjen KU broj
</commit_message>
<xml_diff>
--- a/izvestaj/Podnesak_MUP_Zrenjanin_izjasnjenje.docx
+++ b/izvestaj/Podnesak_MUP_Zrenjanin_izjasnjenje.docx
@@ -44,16 +44,7 @@
         <w:t>ВЕЗА:</w:t>
       </w:r>
       <w:r>
-        <w:t xml:space="preserve"> крађа на броду Бечеј 1, пријављена дана 11.09.2025. године; Допис пуномоћника оштећеног са одштетним захтевом од 24.09.2025. године; КУ бр. [_______] (</w:t>
-      </w:r>
-      <w:r>
-        <w:rPr>
-          <w:i/>
-        </w:rPr>
-        <w:t>уписати број предмета</w:t>
-      </w:r>
-      <w:r>
-        <w:t>)</w:t>
+        <w:t xml:space="preserve"> крађа на броду Бечеј 1, пријављена дана 11.09.2025. године; Допис пуномоћника оштећеног са одштетним захтевом од 24.09.2025. године</w:t>
       </w:r>
     </w:p>
     <w:p>
@@ -499,25 +490,25 @@
         <w:jc w:val="both"/>
       </w:pPr>
       <w:r>
-        <w:t xml:space="preserve">Оштећени </w:t>
+        <w:t xml:space="preserve">Одштетни захтев истакнут дописом пуномоћника оштећеног од 24.09.2025. године, у износу од 1.500.000,00 евра, овим се </w:t>
       </w:r>
       <w:r>
         <w:rPr>
           <w:b/>
         </w:rPr>
-        <w:t>остаје при одштетном захтеву</w:t>
+        <w:t>прецизира и увећава</w:t>
       </w:r>
       <w:r>
-        <w:t xml:space="preserve"> истакнутом дописом пуномоћника оштећеног од 24.09.2025. године, у износу од </w:t>
+        <w:t xml:space="preserve">, имајући у виду да се изгубљена добит континуирано увећава за сваки даљи дан неупотребљивости брода, тако да се на име штете проузроковане извршењем кривичног дела, сагласно чл. 252–256. Законика о кривичном поступку, а у вези са чл. 154, 155, 185, 186, 189. и 395. Закона о облигационим односима, према штетницима 1. и 2. реда истиче одштетни захтев у укупном износу од </w:t>
       </w:r>
       <w:r>
         <w:rPr>
           <w:b/>
         </w:rPr>
-        <w:t>1.500.000,00 евра (словима: милион и по евра)</w:t>
+        <w:t>1.600.000,00 евра (словима: милион и шесто хиљада евра)</w:t>
       </w:r>
       <w:r>
-        <w:t xml:space="preserve"> у динарској противвредности по продајном курсу НБС на дан исплате, према штетницима 1. и 2. реда, сагласно чл. 252–256. Законика о кривичном поступку, а у вези са чл. 154, 155, 185, 186, 189. и 395. Закона о облигационим односима, са законском затезном каматом од дана извршења кривичног дела до исплате.</w:t>
+        <w:t xml:space="preserve"> у динарској противвредности по продајном курсу НБС на дан исплате, са законском затезном каматом од дана извршења кривичног дела до исплате.</w:t>
       </w:r>
     </w:p>
     <w:p>
@@ -608,7 +599,7 @@
               <w:t>Изгубљена добит (измакла корист)</w:t>
             </w:r>
             <w:r>
-              <w:t xml:space="preserve"> — добит коју је оштећени основано очекивао од привредног искоришћавања брода (превоз терета), а која је изостала услед потпуне нефункционалности брода, рачунајући и даљи изостанак експлоатације до оспособљавања брода</w:t>
+              <w:t xml:space="preserve"> — добит коју је оштећени основано очекивао од привредног искоришћавања брода (превоз терета), а која је изостала услед потпуне нефункционалности брода, рачунајући и даљи изостанак експлоатације — која се увећава за приближно 2.000,00 евра за сваки даљи дан неупотребљивости брода</w:t>
             </w:r>
           </w:p>
         </w:tc>
@@ -622,7 +613,7 @@
               <w:rPr>
                 <w:b/>
               </w:rPr>
-              <w:t>900.000,00 евра</w:t>
+              <w:t>1.000.000,00 евра</w:t>
             </w:r>
             <w:r/>
           </w:p>
@@ -654,10 +645,10 @@
               <w:rPr>
                 <w:b/>
               </w:rPr>
-              <w:t>1.500.000,00 евра</w:t>
+              <w:t>1.600.000,00 евра</w:t>
             </w:r>
             <w:r>
-              <w:t xml:space="preserve"> (словима: милион и по евра)</w:t>
+              <w:t xml:space="preserve"> (словима: милион и шесто хиљада евра)</w:t>
             </w:r>
           </w:p>
         </w:tc>
@@ -668,13 +659,22 @@
         <w:jc w:val="both"/>
       </w:pPr>
       <w:r>
-        <w:t>Изгубљена добит обрачуната је полазећи од [</w:t>
+        <w:t xml:space="preserve">Изгубљена добит обрачуната је полазећи од просечне дневне зараде (возарине) брода наведене носивости, која износи приближно </w:t>
+      </w:r>
+      <w:r>
+        <w:rPr>
+          <w:b/>
+        </w:rPr>
+        <w:t>2.000,00 евра дневно</w:t>
+      </w:r>
+      <w:r>
+        <w:t>, помножене бројем дана у којима је брод ван експлоатације, при чему се иста увећава за сваки даљи дан неупотребљивости брода [</w:t>
       </w:r>
       <w:r>
         <w:rPr>
           <w:i/>
         </w:rPr>
-        <w:t>уписати: уговори о превозу / писма о намерама / просечна дневна возарина за брод наведене носивости × број дана ван експлоатације — документација ће бити накнадно достављена</w:t>
+        <w:t>документација о возаринама/уговорима о превозу биће накнадно достављена</w:t>
       </w:r>
       <w:r>
         <w:t>].</w:t>

</xml_diff>

<commit_message>
docs: pravna analiza odgovornosti Begej + 3 verifikovane odluke prakse, ugrađen pravni osnov u podnesak
</commit_message>
<xml_diff>
--- a/izvestaj/Podnesak_MUP_Zrenjanin_izjasnjenje.docx
+++ b/izvestaj/Podnesak_MUP_Zrenjanin_izjasnjenje.docx
@@ -322,7 +322,41 @@
         <w:t>штетници 1. и 2. реда</w:t>
       </w:r>
       <w:r>
-        <w:t xml:space="preserve"> — BEGEJ SHIPYARDS GROUP DOO ZRENJANIN, преко директора Душка Топаловића, који су оштећеном и понудили Записник о преузимању брода, са примопредајом заказаном за дан 11.09.2025. године. Примопредаја није извршена из разлога наведених у тачки I.4. овог изјашњења.</w:t>
+        <w:t xml:space="preserve"> — BEGEJ SHIPYARDS GROUP DOO ZRENJANIN, преко директора Душка Топаловића, који су оштећеном и понудили Записник о преузимању брода, са примопредајом заказаном за дан 11.09.2025. године.</w:t>
+      </w:r>
+    </w:p>
+    <w:p>
+      <w:pPr>
+        <w:jc w:val="both"/>
+      </w:pPr>
+      <w:r>
+        <w:t xml:space="preserve">Лице које обавља посао (извођач радова — посленик) дужно је да по завршеном послу обавести налогодавца (наручиоца) и да му преда ствар у посед ради провере да ли је посао обављен према договореном. Сходно томе, штетник 1. реда је био дужан да брод </w:t>
+      </w:r>
+      <w:r>
+        <w:rPr>
+          <w:b/>
+        </w:rPr>
+        <w:t>преда у посед оштећеном</w:t>
+      </w:r>
+      <w:r>
+        <w:t xml:space="preserve"> (чл. 613. Закона о облигационим односима), а све </w:t>
+      </w:r>
+      <w:r>
+        <w:rPr>
+          <w:b/>
+        </w:rPr>
+        <w:t>док се брод налазио у поседу штетника, до уредне примопредаје, на штетнику је била одговорност за све што се са бродом догоди</w:t>
+      </w:r>
+      <w:r>
+        <w:t>. Управо је штетник, заказивањем Записника о преузимању за 11.09.2025. године, и сам признао да сматра да је посао завршен и брод спреман за предају. Примопредаја, међутим, није извршена из разлога наведених у тачки I.4. овог изјашњења, а пре ње је утврђено да су витални делови брода отуђени, односно да је брод оштећен — док је био искључиво у поседу и под надзором штетника.</w:t>
+      </w:r>
+    </w:p>
+    <w:p>
+      <w:pPr>
+        <w:jc w:val="both"/>
+      </w:pPr>
+      <w:r>
+        <w:t>Детаљна правна анализа одговорности штетника, са одредбама прописа и судском праксом, дата је у тачки IV-А овог изјашњења и у прилозима (Правна анализа и издвојене одлуке судске праксе).</w:t>
       </w:r>
     </w:p>
     <w:p>
@@ -475,6 +509,119 @@
       </w:pPr>
       <w:r>
         <w:t>Све напред наведено фотографисано је на дан примопредаје и документовано у фотодокументацији која чини саставни део извештаја судског вештака.</w:t>
+      </w:r>
+    </w:p>
+    <w:p>
+      <w:pPr>
+        <w:pStyle w:val="Heading2"/>
+      </w:pPr>
+      <w:r>
+        <w:t>IV-А — ОСНОВ ОДГОВОРНОСТИ ШТЕТНИКА</w:t>
+      </w:r>
+    </w:p>
+    <w:p>
+      <w:pPr>
+        <w:jc w:val="both"/>
+      </w:pPr>
+      <w:r>
+        <w:t xml:space="preserve">Однос оштећеног (наручиоца) и штетника 1. реда заснован је као </w:t>
+      </w:r>
+      <w:r>
+        <w:rPr>
+          <w:b/>
+        </w:rPr>
+        <w:t>уговор о делу</w:t>
+      </w:r>
+      <w:r>
+        <w:t xml:space="preserve"> (чл. 600. и даље ЗОО) ради ремонта брода, при чему је брод предат штетнику у државину. Из тог односа за штетника произлази </w:t>
+      </w:r>
+      <w:r>
+        <w:rPr>
+          <w:b/>
+        </w:rPr>
+        <w:t>обавеза чувања поверене ствари</w:t>
+      </w:r>
+      <w:r>
+        <w:t xml:space="preserve"> са пажњом </w:t>
+      </w:r>
+      <w:r>
+        <w:rPr>
+          <w:b/>
+        </w:rPr>
+        <w:t>доброг стручњака</w:t>
+      </w:r>
+      <w:r>
+        <w:t xml:space="preserve">, будући да је реч о професионалном бродоградилишту (чл. 18. ст. 2. ЗОО), као и обавеза да брод по завршетку посла </w:t>
+      </w:r>
+      <w:r>
+        <w:rPr>
+          <w:b/>
+        </w:rPr>
+        <w:t>преда у посед</w:t>
+      </w:r>
+      <w:r>
+        <w:t xml:space="preserve"> оштећеном (чл. 613. ЗОО).</w:t>
+      </w:r>
+    </w:p>
+    <w:p>
+      <w:pPr>
+        <w:jc w:val="both"/>
+      </w:pPr>
+      <w:r>
+        <w:t xml:space="preserve">Како је до отуђења и оштећења делова брода дошло </w:t>
+      </w:r>
+      <w:r>
+        <w:rPr>
+          <w:b/>
+        </w:rPr>
+        <w:t>док је брод био у поседу штетника, пре извршене примопредаје</w:t>
+      </w:r>
+      <w:r>
+        <w:t xml:space="preserve">, штетник за насталу штету одговара по чл. 154. ст. 1, чл. 262. и чл. 18. ст. 2. ЗОО, при чему је </w:t>
+      </w:r>
+      <w:r>
+        <w:rPr>
+          <w:b/>
+        </w:rPr>
+        <w:t>терет доказивања</w:t>
+      </w:r>
+      <w:r>
+        <w:t xml:space="preserve"> да штета није настала његовом кривицом (виша сила, случај) </w:t>
+      </w:r>
+      <w:r>
+        <w:rPr>
+          <w:b/>
+        </w:rPr>
+        <w:t>на штетнику</w:t>
+      </w:r>
+      <w:r>
+        <w:t xml:space="preserve"> (чл. 263, чл. 262. ст. 5. ЗОО). Подела ризика случајне пропасти из чл. 626. ЗОО овде се не примењује, јер се не ради о случајној пропасти, већ о крађи и вандализму услед пропуста штетника у чувању брода.</w:t>
+      </w:r>
+    </w:p>
+    <w:p>
+      <w:pPr>
+        <w:jc w:val="both"/>
+      </w:pPr>
+      <w:r>
+        <w:t xml:space="preserve">Наведено потврђује и судска пракса, нарочито правни став Врховног касационог суда из одлуке </w:t>
+      </w:r>
+      <w:r>
+        <w:rPr>
+          <w:b/>
+        </w:rPr>
+        <w:t>Рев1 7/2017 од 12.10.2017. године</w:t>
+      </w:r>
+      <w:r>
+        <w:t xml:space="preserve">: </w:t>
+      </w:r>
+      <w:r>
+        <w:rPr>
+          <w:i/>
+        </w:rPr>
+        <w:t>„Губитак, пропаст или оштећење ствари другог лица ствара обавезу држаоца ствари да власнику накнади штету у новцу у висини њене тржишне противвредности."</w:t>
+      </w:r>
+      <w:r>
+        <w:t xml:space="preserve"> (детаљно у прилогу — Правна анализа и издвојене одлуке).</w:t>
       </w:r>
     </w:p>
     <w:p>
@@ -796,7 +943,23 @@
         <w:ind w:left="425"/>
       </w:pPr>
       <w:r>
-        <w:t>5. пуномоћ.</w:t>
+        <w:t>5. Правна анализа одговорности штетника (са одредбама прописа и судском праксом);</w:t>
+      </w:r>
+    </w:p>
+    <w:p>
+      <w:pPr>
+        <w:ind w:left="425"/>
+      </w:pPr>
+      <w:r>
+        <w:t>6. Издвојене одлуке судске праксе (Рев1 7/2017; Рев 12733/2024; Прев 154/2023);</w:t>
+      </w:r>
+    </w:p>
+    <w:p>
+      <w:pPr>
+        <w:ind w:left="425"/>
+      </w:pPr>
+      <w:r>
+        <w:t>7. пуномоћ.</w:t>
       </w:r>
     </w:p>
     <w:p>

</xml_diff>

<commit_message>
docs: totalna šteta po stavkama i kao osnov obične štete (visinu utvrđuje veštak); uklonjena napomena o vozarinama
</commit_message>
<xml_diff>
--- a/izvestaj/Podnesak_MUP_Zrenjanin_izjasnjenje.docx
+++ b/izvestaj/Podnesak_MUP_Zrenjanin_izjasnjenje.docx
@@ -452,7 +452,16 @@
         <w:ind w:left="425"/>
       </w:pPr>
       <w:r>
-        <w:t>1. бродска кабина (оштећена);</w:t>
+        <w:t xml:space="preserve">1. бродска кабина (оштећена) — </w:t>
+      </w:r>
+      <w:r>
+        <w:rPr>
+          <w:b/>
+        </w:rPr>
+        <w:t>тотална штета</w:t>
+      </w:r>
+      <w:r>
+        <w:t>;</w:t>
       </w:r>
     </w:p>
     <w:p>
@@ -460,7 +469,16 @@
         <w:ind w:left="425"/>
       </w:pPr>
       <w:r>
-        <w:t>2. врата кабине (оштећена);</w:t>
+        <w:t xml:space="preserve">2. врата кабине (оштећена) — </w:t>
+      </w:r>
+      <w:r>
+        <w:rPr>
+          <w:b/>
+        </w:rPr>
+        <w:t>тотална штета</w:t>
+      </w:r>
+      <w:r>
+        <w:t>;</w:t>
       </w:r>
     </w:p>
     <w:p>
@@ -468,7 +486,16 @@
         <w:ind w:left="425"/>
       </w:pPr>
       <w:r>
-        <w:t>3. електрична инсталација брода (исечена);</w:t>
+        <w:t xml:space="preserve">3. електрична инсталација брода (исечена) — </w:t>
+      </w:r>
+      <w:r>
+        <w:rPr>
+          <w:b/>
+        </w:rPr>
+        <w:t>тотална штета</w:t>
+      </w:r>
+      <w:r>
+        <w:t>;</w:t>
       </w:r>
     </w:p>
     <w:p>
@@ -476,7 +503,16 @@
         <w:ind w:left="425"/>
       </w:pPr>
       <w:r>
-        <w:t>4. бродске кабине — стамбени простор (вандализован);</w:t>
+        <w:t xml:space="preserve">4. бродске кабине — стамбени простор (вандализован) — </w:t>
+      </w:r>
+      <w:r>
+        <w:rPr>
+          <w:b/>
+        </w:rPr>
+        <w:t>тотална штета</w:t>
+      </w:r>
+      <w:r>
+        <w:t>;</w:t>
       </w:r>
     </w:p>
     <w:p>
@@ -484,7 +520,16 @@
         <w:ind w:left="425"/>
       </w:pPr>
       <w:r>
-        <w:t>5. машински простор (оштећен);</w:t>
+        <w:t xml:space="preserve">5. машински простор (оштећен) — </w:t>
+      </w:r>
+      <w:r>
+        <w:rPr>
+          <w:b/>
+        </w:rPr>
+        <w:t>тотална штета</w:t>
+      </w:r>
+      <w:r>
+        <w:t>;</w:t>
       </w:r>
     </w:p>
     <w:p>
@@ -492,7 +537,16 @@
         <w:ind w:left="425"/>
       </w:pPr>
       <w:r>
-        <w:t>6. један погонски агрегат — мотор (оштећен скидањем главе мотора);</w:t>
+        <w:t xml:space="preserve">6. један погонски агрегат — мотор (оштећен скидањем главе мотора) — </w:t>
+      </w:r>
+      <w:r>
+        <w:rPr>
+          <w:b/>
+        </w:rPr>
+        <w:t>тотална штета</w:t>
+      </w:r>
+      <w:r>
+        <w:t>;</w:t>
       </w:r>
     </w:p>
     <w:p>
@@ -500,7 +554,16 @@
         <w:ind w:left="425"/>
       </w:pPr>
       <w:r>
-        <w:t>7. хидраулична инсталација у машинском простору (исечена).</w:t>
+        <w:t xml:space="preserve">7. хидраулична инсталација у машинском простору (исечена) — </w:t>
+      </w:r>
+      <w:r>
+        <w:rPr>
+          <w:b/>
+        </w:rPr>
+        <w:t>тотална штета</w:t>
+      </w:r>
+      <w:r>
+        <w:t>.</w:t>
       </w:r>
     </w:p>
     <w:p>
@@ -643,19 +706,52 @@
         <w:rPr>
           <w:b/>
         </w:rPr>
-        <w:t>прецизира и увећава</w:t>
+        <w:t>прецизира</w:t>
       </w:r>
       <w:r>
-        <w:t xml:space="preserve">, имајући у виду да се изгубљена добит континуирано увећава за сваки даљи дан неупотребљивости брода, тако да се на име штете проузроковане извршењем кривичног дела, сагласно чл. 252–256. Законика о кривичном поступку, а у вези са чл. 154, 155, 185, 186, 189. и 395. Закона о облигационим односима, према штетницима 1. и 2. реда истиче одштетни захтев у укупном износу од </w:t>
+        <w:t>, тако да се на име штете проузроковане извршењем кривичног дела, сагласно чл. 252–256. Законика о кривичном поступку, а у вези са чл. 154, 155, 185, 186, 189. и 395. Закона о облигационим односима, према штетницима 1. и 2. реда истиче одштетни захтев који обухвата обичну (стварну) штету и изгубљену добит, све у динарској противвредности по продајном курсу НБС на дан исплате, са законском затезном каматом од дана извршења кривичног дела до исплате.</w:t>
+      </w:r>
+    </w:p>
+    <w:p>
+      <w:pPr>
+        <w:jc w:val="both"/>
+      </w:pPr>
+      <w:r/>
+      <w:r>
+        <w:rPr>
+          <w:b/>
+        </w:rPr>
+        <w:t>Тотална штета на броду.</w:t>
+      </w:r>
+      <w:r>
+        <w:t xml:space="preserve"> Отуђењем средства порива и погона брода (оба пропулзера „Schottel" са целокупним системом — два Z погона), агрегата, оштећењем једног погонског агрегата (мотора), исецањем електричне и хидрауличне инсталације и девастирањем кабине и стамбеног простора, брод је изгубио </w:t>
       </w:r>
       <w:r>
         <w:rPr>
           <w:b/>
         </w:rPr>
-        <w:t>1.600.000,00 евра (словима: милион и шесто хиљада евра)</w:t>
+        <w:t>сва битна својства и функције</w:t>
       </w:r>
       <w:r>
-        <w:t xml:space="preserve"> у динарској противвредности по продајном курсу НБС на дан исплате, са законском затезном каматом од дана извршења кривичног дела до исплате.</w:t>
+        <w:t xml:space="preserve"> због којих би се могао назвати бродом. Брод више није способан ни за пловидбу, ни за погон, ни за привредно искоришћавање — он данас представља </w:t>
+      </w:r>
+      <w:r>
+        <w:rPr>
+          <w:b/>
+        </w:rPr>
+        <w:t>пуку хрпу метала</w:t>
+      </w:r>
+      <w:r>
+        <w:t xml:space="preserve">. Стога је несумњиво да је на броду наступила </w:t>
+      </w:r>
+      <w:r>
+        <w:rPr>
+          <w:b/>
+        </w:rPr>
+        <w:t>ТОТАЛНА ШТЕТА</w:t>
+      </w:r>
+      <w:r>
+        <w:t>, па висина обичне (стварне) штете одговара вредности брода у целини. Тачну висину тоталне штете утврдиће судски вештак одговарајуће струке.</w:t>
       </w:r>
     </w:p>
     <w:p>
@@ -712,7 +808,7 @@
               <w:t>Обична (стварна) штета</w:t>
             </w:r>
             <w:r>
-              <w:t xml:space="preserve"> — вредност отуђених ствари из тачке III/А и трошкови поправке оштећених ствари из тачке III/Б</w:t>
+              <w:t xml:space="preserve"> — тотална штета на броду (брод је изгубио сва својства брода и представља хрпу метала); вредност одговара вредности брода у целини</w:t>
             </w:r>
           </w:p>
         </w:tc>
@@ -726,7 +822,7 @@
               <w:rPr>
                 <w:b/>
               </w:rPr>
-              <w:t>600.000,00 евра</w:t>
+              <w:t>висину утврђује судски вештак (тотална штета)</w:t>
             </w:r>
             <w:r/>
           </w:p>
@@ -792,11 +888,9 @@
               <w:rPr>
                 <w:b/>
               </w:rPr>
-              <w:t>1.600.000,00 евра</w:t>
+              <w:t>износ тоталне штете по налазу вештака + 1.000.000,00 евра изгубљене добити</w:t>
             </w:r>
-            <w:r>
-              <w:t xml:space="preserve"> (словима: милион и шесто хиљада евра)</w:t>
-            </w:r>
+            <w:r/>
           </w:p>
         </w:tc>
       </w:tr>
@@ -815,16 +909,7 @@
         <w:t>2.000,00 евра дневно</w:t>
       </w:r>
       <w:r>
-        <w:t>, помножене бројем дана у којима је брод ван експлоатације, при чему се иста увећава за сваки даљи дан неупотребљивости брода [</w:t>
-      </w:r>
-      <w:r>
-        <w:rPr>
-          <w:i/>
-        </w:rPr>
-        <w:t>документација о возаринама/уговорима о превозу биће накнадно достављена</w:t>
-      </w:r>
-      <w:r>
-        <w:t>].</w:t>
+        <w:t>, помножене бројем дана у којима је брод ван експлоатације, при чему се иста увећава за сваки даљи дан неупотребљивости брода.</w:t>
       </w:r>
     </w:p>
     <w:p>
@@ -836,10 +921,10 @@
         <w:rPr>
           <w:b/>
         </w:rPr>
-        <w:t>Напомена о вредности појединачних ствари:</w:t>
+        <w:t>Напомена:</w:t>
       </w:r>
       <w:r>
-        <w:t xml:space="preserve"> вредност сваке појединачне отуђене, односно оштећене ствари из тачке III биће прецизно утврђена целокупном дефектажом брода од стране сервисера машинске и електро струке и вештачењем одговарајуће струке, како је констатовано у извештају судског вештака. Оштећени задржава право да одштетни захтев прецизира, односно измени по извршеној дефектажи и вештачењу, као и да део захтева остварује у парничном поступку (чл. 252. ст. 2. и чл. 258. ЗКП).</w:t>
+        <w:t xml:space="preserve"> висина обичне (тоталне) штете биће прецизно утврђена вештачењем одговарајуће струке, односно целокупном дефектажом брода, како је констатовано у извештају судског вештака. Оштећени задржава право да одштетни захтев прецизира, односно измени по извршеном вештачењу, као и да део захтева остварује у парничном поступку (чл. 252. ст. 2. и чл. 258. ЗКП).</w:t>
       </w:r>
     </w:p>
     <w:p>

</xml_diff>

<commit_message>
docs: obična šteta 700.000 EUR (vrednost funkcionalnog broda sa dozvolom LK), ukupno 1.700.000
</commit_message>
<xml_diff>
--- a/izvestaj/Podnesak_MUP_Zrenjanin_izjasnjenje.docx
+++ b/izvestaj/Podnesak_MUP_Zrenjanin_izjasnjenje.docx
@@ -706,10 +706,19 @@
         <w:rPr>
           <w:b/>
         </w:rPr>
-        <w:t>прецизира</w:t>
+        <w:t>прецизира и увећава</w:t>
       </w:r>
       <w:r>
-        <w:t>, тако да се на име штете проузроковане извршењем кривичног дела, сагласно чл. 252–256. Законика о кривичном поступку, а у вези са чл. 154, 155, 185, 186, 189. и 395. Закона о облигационим односима, према штетницима 1. и 2. реда истиче одштетни захтев који обухвата обичну (стварну) штету и изгубљену добит, све у динарској противвредности по продајном курсу НБС на дан исплате, са законском затезном каматом од дана извршења кривичног дела до исплате.</w:t>
+        <w:t xml:space="preserve">, тако да се на име штете проузроковане извршењем кривичног дела, сагласно чл. 252–256. Законика о кривичном поступку, а у вези са чл. 154, 155, 185, 186, 189. и 395. Закона о облигационим односима, према штетницима 1. и 2. реда истиче одштетни захтев у укупном износу од </w:t>
+      </w:r>
+      <w:r>
+        <w:rPr>
+          <w:b/>
+        </w:rPr>
+        <w:t>1.700.000,00 евра (словима: милион и седамсто хиљада евра)</w:t>
+      </w:r>
+      <w:r>
+        <w:t>, све у динарској противвредности по продајном курсу НБС на дан исплате, са законском затезном каматом од дана извршења кривичног дела до исплате.</w:t>
       </w:r>
     </w:p>
     <w:p>
@@ -751,7 +760,16 @@
         <w:t>ТОТАЛНА ШТЕТА</w:t>
       </w:r>
       <w:r>
-        <w:t>, па висина обичне (стварне) штете одговара вредности брода у целини. Тачну висину тоталне штете утврдиће судски вештак одговарајуће струке.</w:t>
+        <w:t xml:space="preserve">. Вредност функционалног брода ове врсте, који поседује важећу дозволу Лучке капетаније за пловидбу, износи </w:t>
+      </w:r>
+      <w:r>
+        <w:rPr>
+          <w:b/>
+        </w:rPr>
+        <w:t>700.000,00 евра</w:t>
+      </w:r>
+      <w:r>
+        <w:t>, и тај износ представља обичну (стварну) штету насталу тоталном штетом на броду.</w:t>
       </w:r>
     </w:p>
     <w:p>
@@ -808,7 +826,7 @@
               <w:t>Обична (стварна) штета</w:t>
             </w:r>
             <w:r>
-              <w:t xml:space="preserve"> — тотална штета на броду (брод је изгубио сва својства брода и представља хрпу метала); вредност одговара вредности брода у целини</w:t>
+              <w:t xml:space="preserve"> — тотална штета на броду; вредност функционалног брода ове врсте са важећом дозволом Лучке капетаније за пловидбу</w:t>
             </w:r>
           </w:p>
         </w:tc>
@@ -822,7 +840,7 @@
               <w:rPr>
                 <w:b/>
               </w:rPr>
-              <w:t>висину утврђује судски вештак (тотална штета)</w:t>
+              <w:t>700.000,00 евра</w:t>
             </w:r>
             <w:r/>
           </w:p>
@@ -888,9 +906,11 @@
               <w:rPr>
                 <w:b/>
               </w:rPr>
-              <w:t>износ тоталне штете по налазу вештака + 1.000.000,00 евра изгубљене добити</w:t>
+              <w:t>1.700.000,00 евра</w:t>
             </w:r>
-            <w:r/>
+            <w:r>
+              <w:t xml:space="preserve"> (словима: милион и седамсто хиљада евра)</w:t>
+            </w:r>
           </w:p>
         </w:tc>
       </w:tr>
@@ -924,7 +944,7 @@
         <w:t>Напомена:</w:t>
       </w:r>
       <w:r>
-        <w:t xml:space="preserve"> висина обичне (тоталне) штете биће прецизно утврђена вештачењем одговарајуће струке, односно целокупном дефектажом брода, како је констатовано у извештају судског вештака. Оштећени задржава право да одштетни захтев прецизира, односно измени по извршеном вештачењу, као и да део захтева остварује у парничном поступку (чл. 252. ст. 2. и чл. 258. ЗКП).</w:t>
+        <w:t xml:space="preserve"> наведени износи биће додатно поткрепљени вештачењем одговарајуће струке, односно целокупном дефектажом брода, како је констатовано у извештају судског вештака. Оштећени задржава право да одштетни захтев прецизира, односно измени по извршеном вештачењу, као и да део захтева остварује у парничном поступку (чл. 252. ст. 2. и чл. 258. ЗКП).</w:t>
       </w:r>
     </w:p>
     <w:p>

</xml_diff>

<commit_message>
docs: dodata krivica Begeja za izgubljenu dobit, izbačena tačka 2 predloga, potpis advokata desno poravnat
</commit_message>
<xml_diff>
--- a/izvestaj/Podnesak_MUP_Zrenjanin_izjasnjenje.docx
+++ b/izvestaj/Podnesak_MUP_Zrenjanin_izjasnjenje.docx
@@ -929,7 +929,16 @@
         <w:t>2.000,00 евра дневно</w:t>
       </w:r>
       <w:r>
-        <w:t>, помножене бројем дана у којима је брод ван експлоатације, при чему се иста увећава за сваки даљи дан неупотребљивости брода.</w:t>
+        <w:t xml:space="preserve">, помножене бројем дана у којима је брод ван експлоатације, при чему се иста увећава за сваки даљи дан неупотребљивости брода </w:t>
+      </w:r>
+      <w:r>
+        <w:rPr>
+          <w:b/>
+        </w:rPr>
+        <w:t>кривицом BEGEJ SHIPYARDS GROUP DOO ZRENJANIN</w:t>
+      </w:r>
+      <w:r>
+        <w:t>.</w:t>
       </w:r>
     </w:p>
     <w:p>
@@ -976,7 +985,7 @@
         <w:ind w:left="425"/>
       </w:pPr>
       <w:r>
-        <w:t>2. од штетника 1. реда прибави документацију о пријему брода на ремонт, изведеним радовима и лицима која су имала приступ броду;</w:t>
+        <w:t>2. предузме мере из своје надлежности ради проналаска отуђених ствари (посебно два пропулзера „Schottel", радара, радио станице и агрегата) и идентификовања извршилаца;</w:t>
       </w:r>
     </w:p>
     <w:p>
@@ -984,15 +993,7 @@
         <w:ind w:left="425"/>
       </w:pPr>
       <w:r>
-        <w:t>3. предузме мере из своје надлежности ради проналаска отуђених ствари (посебно два пропулзера „Schottel", радара, радио станице и агрегата) и идентификовања извршилаца;</w:t>
-      </w:r>
-    </w:p>
-    <w:p>
-      <w:pPr>
-        <w:ind w:left="425"/>
-      </w:pPr>
-      <w:r>
-        <w:t>4. о предузетим мерама обавести оштећеног преко пуномоћника.</w:t>
+        <w:t>3. о предузетим мерама обавести оштећеног преко пуномоћника.</w:t>
       </w:r>
     </w:p>
     <w:p>
@@ -1093,7 +1094,7 @@
     </w:p>
     <w:p>
       <w:pPr>
-        <w:jc w:val="both"/>
+        <w:jc w:val="right"/>
       </w:pPr>
       <w:r/>
       <w:r>
@@ -1106,7 +1107,7 @@
     </w:p>
     <w:p>
       <w:pPr>
-        <w:jc w:val="both"/>
+        <w:jc w:val="right"/>
       </w:pPr>
       <w:r>
         <w:t>___________________________</w:t>

</xml_diff>

<commit_message>
docs: izbačena IV-A sekcija iz podneska, svi naslovi crni
</commit_message>
<xml_diff>
--- a/izvestaj/Podnesak_MUP_Zrenjanin_izjasnjenje.docx
+++ b/izvestaj/Podnesak_MUP_Zrenjanin_izjasnjenje.docx
@@ -8,6 +8,9 @@
         <w:jc w:val="center"/>
       </w:pPr>
       <w:r>
+        <w:rPr>
+          <w:color w:val="000000"/>
+        </w:rPr>
         <w:t>МИНИСТАРСТВО УНУТРАШЊИХ ПОСЛОВА</w:t>
       </w:r>
     </w:p>
@@ -97,6 +100,9 @@
         <w:jc w:val="center"/>
       </w:pPr>
       <w:r>
+        <w:rPr>
+          <w:color w:val="000000"/>
+        </w:rPr>
         <w:t>ИЗЈАШЊЕЊЕ ПУНОМОЋНИКА ОШТЕЋЕНОГ НА ОКОЛНОСТИ ВРЕДНОСТИ ОТУЂЕНИХ СТВАРИ — ТАКСАТИВНИ ПОПИС ОТУЂЕНИХ И ОШТЕЋЕНИХ СТВАРИ — СА ОДШТЕТНИМ ЗАХТЕВОМ</w:t>
       </w:r>
     </w:p>
@@ -129,6 +135,9 @@
         <w:pStyle w:val="Heading2"/>
       </w:pPr>
       <w:r>
+        <w:rPr>
+          <w:color w:val="000000"/>
+        </w:rPr>
         <w:t>I — ЧИЊЕНИЧНИ ОСНОВ</w:t>
       </w:r>
     </w:p>
@@ -205,6 +214,9 @@
         <w:pStyle w:val="Heading2"/>
       </w:pPr>
       <w:r>
+        <w:rPr>
+          <w:color w:val="000000"/>
+        </w:rPr>
         <w:t>II — ИЗЈАШЊЕЊЕ НА ПОСТАВЉЕНА ПИТАЊА</w:t>
       </w:r>
     </w:p>
@@ -213,6 +225,9 @@
         <w:pStyle w:val="Heading3"/>
       </w:pPr>
       <w:r>
+        <w:rPr>
+          <w:color w:val="000000"/>
+        </w:rPr>
         <w:t>1. Колико је брод стар</w:t>
       </w:r>
     </w:p>
@@ -255,6 +270,9 @@
         <w:pStyle w:val="Heading3"/>
       </w:pPr>
       <w:r>
+        <w:rPr>
+          <w:color w:val="000000"/>
+        </w:rPr>
         <w:t>2. Колико су стари отуђени делови</w:t>
       </w:r>
     </w:p>
@@ -280,6 +298,9 @@
         <w:pStyle w:val="Heading3"/>
       </w:pPr>
       <w:r>
+        <w:rPr>
+          <w:color w:val="000000"/>
+        </w:rPr>
         <w:t>3. Коме је брод остављен на ремонт</w:t>
       </w:r>
     </w:p>
@@ -305,6 +326,9 @@
         <w:pStyle w:val="Heading3"/>
       </w:pPr>
       <w:r>
+        <w:rPr>
+          <w:color w:val="000000"/>
+        </w:rPr>
         <w:t>4. Ко је требало да изврши примопредају брода по завршеним радовима</w:t>
       </w:r>
     </w:p>
@@ -356,7 +380,7 @@
         <w:jc w:val="both"/>
       </w:pPr>
       <w:r>
-        <w:t>Детаљна правна анализа одговорности штетника, са одредбама прописа и судском праксом, дата је у тачки IV-А овог изјашњења и у прилозима (Правна анализа и издвојене одлуке судске праксе).</w:t>
+        <w:t>Детаљна правна анализа одговорности штетника, са одредбама прописа и судском праксом, дата је у прилозима (Правна анализа и издвојене одлуке судске праксе).</w:t>
       </w:r>
     </w:p>
     <w:p>
@@ -364,6 +388,9 @@
         <w:pStyle w:val="Heading2"/>
       </w:pPr>
       <w:r>
+        <w:rPr>
+          <w:color w:val="000000"/>
+        </w:rPr>
         <w:t>III — ТАКСАТИВНИ ПОПИС ОТУЂЕНИХ И ОШТЕЋЕНИХ СТВАРИ</w:t>
       </w:r>
     </w:p>
@@ -380,6 +407,9 @@
         <w:pStyle w:val="Heading3"/>
       </w:pPr>
       <w:r>
+        <w:rPr>
+          <w:color w:val="000000"/>
+        </w:rPr>
         <w:t>А) Отуђене ствари (недостају, односно покрадене су са брода)</w:t>
       </w:r>
     </w:p>
@@ -444,6 +474,9 @@
         <w:pStyle w:val="Heading3"/>
       </w:pPr>
       <w:r>
+        <w:rPr>
+          <w:color w:val="000000"/>
+        </w:rPr>
         <w:t>Б) Оштећене, односно уништене ствари</w:t>
       </w:r>
     </w:p>
@@ -579,119 +612,9 @@
         <w:pStyle w:val="Heading2"/>
       </w:pPr>
       <w:r>
-        <w:t>IV-А — ОСНОВ ОДГОВОРНОСТИ ШТЕТНИКА</w:t>
-      </w:r>
-    </w:p>
-    <w:p>
-      <w:pPr>
-        <w:jc w:val="both"/>
-      </w:pPr>
-      <w:r>
-        <w:t xml:space="preserve">Однос оштећеног (наручиоца) и штетника 1. реда заснован је као </w:t>
-      </w:r>
-      <w:r>
         <w:rPr>
-          <w:b/>
+          <w:color w:val="000000"/>
         </w:rPr>
-        <w:t>уговор о делу</w:t>
-      </w:r>
-      <w:r>
-        <w:t xml:space="preserve"> (чл. 600. и даље ЗОО) ради ремонта брода, при чему је брод предат штетнику у државину. Из тог односа за штетника произлази </w:t>
-      </w:r>
-      <w:r>
-        <w:rPr>
-          <w:b/>
-        </w:rPr>
-        <w:t>обавеза чувања поверене ствари</w:t>
-      </w:r>
-      <w:r>
-        <w:t xml:space="preserve"> са пажњом </w:t>
-      </w:r>
-      <w:r>
-        <w:rPr>
-          <w:b/>
-        </w:rPr>
-        <w:t>доброг стручњака</w:t>
-      </w:r>
-      <w:r>
-        <w:t xml:space="preserve">, будући да је реч о професионалном бродоградилишту (чл. 18. ст. 2. ЗОО), као и обавеза да брод по завршетку посла </w:t>
-      </w:r>
-      <w:r>
-        <w:rPr>
-          <w:b/>
-        </w:rPr>
-        <w:t>преда у посед</w:t>
-      </w:r>
-      <w:r>
-        <w:t xml:space="preserve"> оштећеном (чл. 613. ЗОО).</w:t>
-      </w:r>
-    </w:p>
-    <w:p>
-      <w:pPr>
-        <w:jc w:val="both"/>
-      </w:pPr>
-      <w:r>
-        <w:t xml:space="preserve">Како је до отуђења и оштећења делова брода дошло </w:t>
-      </w:r>
-      <w:r>
-        <w:rPr>
-          <w:b/>
-        </w:rPr>
-        <w:t>док је брод био у поседу штетника, пре извршене примопредаје</w:t>
-      </w:r>
-      <w:r>
-        <w:t xml:space="preserve">, штетник за насталу штету одговара по чл. 154. ст. 1, чл. 262. и чл. 18. ст. 2. ЗОО, при чему је </w:t>
-      </w:r>
-      <w:r>
-        <w:rPr>
-          <w:b/>
-        </w:rPr>
-        <w:t>терет доказивања</w:t>
-      </w:r>
-      <w:r>
-        <w:t xml:space="preserve"> да штета није настала његовом кривицом (виша сила, случај) </w:t>
-      </w:r>
-      <w:r>
-        <w:rPr>
-          <w:b/>
-        </w:rPr>
-        <w:t>на штетнику</w:t>
-      </w:r>
-      <w:r>
-        <w:t xml:space="preserve"> (чл. 263, чл. 262. ст. 5. ЗОО). Подела ризика случајне пропасти из чл. 626. ЗОО овде се не примењује, јер се не ради о случајној пропасти, већ о крађи и вандализму услед пропуста штетника у чувању брода.</w:t>
-      </w:r>
-    </w:p>
-    <w:p>
-      <w:pPr>
-        <w:jc w:val="both"/>
-      </w:pPr>
-      <w:r>
-        <w:t xml:space="preserve">Наведено потврђује и судска пракса, нарочито правни став Врховног касационог суда из одлуке </w:t>
-      </w:r>
-      <w:r>
-        <w:rPr>
-          <w:b/>
-        </w:rPr>
-        <w:t>Рев1 7/2017 од 12.10.2017. године</w:t>
-      </w:r>
-      <w:r>
-        <w:t xml:space="preserve">: </w:t>
-      </w:r>
-      <w:r>
-        <w:rPr>
-          <w:i/>
-        </w:rPr>
-        <w:t>„Губитак, пропаст или оштећење ствари другог лица ствара обавезу држаоца ствари да власнику накнади штету у новцу у висини њене тржишне противвредности."</w:t>
-      </w:r>
-      <w:r>
-        <w:t xml:space="preserve"> (детаљно у прилогу — Правна анализа и издвојене одлуке).</w:t>
-      </w:r>
-    </w:p>
-    <w:p>
-      <w:pPr>
-        <w:pStyle w:val="Heading2"/>
-      </w:pPr>
-      <w:r>
         <w:t>IV — ОДШТЕТНИ ЗАХТЕВ</w:t>
       </w:r>
     </w:p>
@@ -961,6 +884,9 @@
         <w:pStyle w:val="Heading2"/>
       </w:pPr>
       <w:r>
+        <w:rPr>
+          <w:color w:val="000000"/>
+        </w:rPr>
         <w:t>V — ПРЕДЛОГ</w:t>
       </w:r>
     </w:p>
@@ -1001,6 +927,9 @@
         <w:pStyle w:val="Heading2"/>
       </w:pPr>
       <w:r>
+        <w:rPr>
+          <w:color w:val="000000"/>
+        </w:rPr>
         <w:t>ДОКАЗИ</w:t>
       </w:r>
     </w:p>

</xml_diff>

<commit_message>
docs: predaja na remont pre nekoliko godina, lokalitet u okolini Zrenjanina
</commit_message>
<xml_diff>
--- a/izvestaj/Podnesak_MUP_Zrenjanin_izjasnjenje.docx
+++ b/izvestaj/Podnesak_MUP_Zrenjanin_izjasnjenje.docx
@@ -163,7 +163,16 @@
         <w:ind w:left="425"/>
       </w:pPr>
       <w:r>
-        <w:t>2. Предметни брод предат је на ремонт штетнику 1. реда — бродоградилишту BEGEJ SHIPYARDS GROUP DOO ZRENJANIN, чија је претежна регистрована делатност поправка и одржавање бродова и чамаца (шифра делатности 3315), [</w:t>
+        <w:t xml:space="preserve">2. Предметни брод предат је на ремонт штетнику 1. реда — бродоградилишту BEGEJ SHIPYARDS GROUP DOO ZRENJANIN, чија је претежна регистрована делатност поправка и одржавање бродова и чамаца (шифра делатности 3315), још </w:t>
+      </w:r>
+      <w:r>
+        <w:rPr>
+          <w:b/>
+        </w:rPr>
+        <w:t>пре неколико година</w:t>
+      </w:r>
+      <w:r>
+        <w:t xml:space="preserve"> [</w:t>
       </w:r>
       <w:r>
         <w:rPr>
@@ -172,7 +181,7 @@
         <w:t>уписати: број и датум уговора о ремонту / радног налога, односно основ предаје</w:t>
       </w:r>
       <w:r>
-        <w:t>], дана [____________] године. Брод се налазио на локалитету Перлез, код преводнице Перлез.</w:t>
+        <w:t>]. Брод се од тада налазио на локалитету у околини Зрењанина, у државини и под надзором штетника 1. реда.</w:t>
       </w:r>
     </w:p>
     <w:p>

</xml_diff>

<commit_message>
docs: ukloni placeholder za ugovor o remontu, ostaje samo pre nekoliko godina
</commit_message>
<xml_diff>
--- a/izvestaj/Podnesak_MUP_Zrenjanin_izjasnjenje.docx
+++ b/izvestaj/Podnesak_MUP_Zrenjanin_izjasnjenje.docx
@@ -172,16 +172,7 @@
         <w:t>пре неколико година</w:t>
       </w:r>
       <w:r>
-        <w:t xml:space="preserve"> [</w:t>
-      </w:r>
-      <w:r>
-        <w:rPr>
-          <w:i/>
-        </w:rPr>
-        <w:t>уписати: број и датум уговора о ремонту / радног налога, односно основ предаје</w:t>
-      </w:r>
-      <w:r>
-        <w:t>]. Брод се од тада налазио на локалитету у околини Зрењанина, у државини и под надзором штетника 1. реда.</w:t>
+        <w:t>. Брод се од тада налазио на локалитету у околини Зрењанина, у државини и под надзором штетника 1. реда.</w:t>
       </w:r>
     </w:p>
     <w:p>

</xml_diff>